<commit_message>
prelab 5 backup and lab 5 outline
added prelab 5 simulation (ltspice schematic and results), pdf, and word files
added outline of lab 5 report
</commit_message>
<xml_diff>
--- a/Lab05/PreLab05/PreLab5_HannahKelley.docx
+++ b/Lab05/PreLab05/PreLab5_HannahKelley.docx
@@ -127,23 +127,13 @@
           <w:szCs w:val="52"/>
         </w:rPr>
       </w:pPr>
-      <w:proofErr w:type="gramStart"/>
       <w:r>
         <w:rPr>
           <w:rFonts w:ascii="Times New Roman" w:hAnsi="Times New Roman" w:cs="Times New Roman"/>
           <w:sz w:val="52"/>
           <w:szCs w:val="52"/>
         </w:rPr>
-        <w:t>By</w:t>
-      </w:r>
-      <w:proofErr w:type="gramEnd"/>
-      <w:r>
-        <w:rPr>
-          <w:rFonts w:ascii="Times New Roman" w:hAnsi="Times New Roman" w:cs="Times New Roman"/>
-          <w:sz w:val="52"/>
-          <w:szCs w:val="52"/>
-        </w:rPr>
-        <w:t>: Hannah Kelley</w:t>
+        <w:t>By: Hannah Kelley</w:t>
       </w:r>
     </w:p>
     <w:p>
@@ -5948,7 +5938,2962 @@
         <w:t>Simulations and Results:</w:t>
       </w:r>
     </w:p>
-    <w:p/>
+    <w:p>
+      <w:pPr>
+        <w:spacing w:after="0" w:line="480" w:lineRule="auto"/>
+        <w:rPr>
+          <w:rFonts w:ascii="Times New Roman" w:eastAsiaTheme="minorEastAsia" w:hAnsi="Times New Roman" w:cs="Times New Roman"/>
+        </w:rPr>
+      </w:pPr>
+      <w:r>
+        <w:rPr>
+          <w:rFonts w:ascii="Times New Roman" w:hAnsi="Times New Roman" w:cs="Times New Roman"/>
+        </w:rPr>
+        <w:t xml:space="preserve">LTSpice was used to simulate both a low pass and high pass filter with </w:t>
+      </w:r>
+      <m:oMath>
+        <m:sSub>
+          <m:sSubPr>
+            <m:ctrlPr>
+              <w:rPr>
+                <w:rFonts w:ascii="Cambria Math" w:hAnsi="Cambria Math" w:cs="Times New Roman"/>
+                <w:i/>
+              </w:rPr>
+            </m:ctrlPr>
+          </m:sSubPr>
+          <m:e>
+            <m:r>
+              <w:rPr>
+                <w:rFonts w:ascii="Cambria Math" w:hAnsi="Cambria Math" w:cs="Times New Roman"/>
+              </w:rPr>
+              <m:t>V</m:t>
+            </m:r>
+          </m:e>
+          <m:sub>
+            <m:r>
+              <w:rPr>
+                <w:rFonts w:ascii="Cambria Math" w:hAnsi="Cambria Math" w:cs="Times New Roman"/>
+              </w:rPr>
+              <m:t>in</m:t>
+            </m:r>
+          </m:sub>
+        </m:sSub>
+        <m:r>
+          <w:rPr>
+            <w:rFonts w:ascii="Cambria Math" w:eastAsiaTheme="minorEastAsia" w:hAnsi="Cambria Math" w:cs="Times New Roman"/>
+          </w:rPr>
+          <m:t>=4</m:t>
+        </m:r>
+        <m:sSub>
+          <m:sSubPr>
+            <m:ctrlPr>
+              <w:rPr>
+                <w:rFonts w:ascii="Cambria Math" w:eastAsiaTheme="minorEastAsia" w:hAnsi="Cambria Math" w:cs="Times New Roman"/>
+                <w:i/>
+              </w:rPr>
+            </m:ctrlPr>
+          </m:sSubPr>
+          <m:e>
+            <m:r>
+              <w:rPr>
+                <w:rFonts w:ascii="Cambria Math" w:eastAsiaTheme="minorEastAsia" w:hAnsi="Cambria Math" w:cs="Times New Roman"/>
+              </w:rPr>
+              <m:t>V</m:t>
+            </m:r>
+          </m:e>
+          <m:sub>
+            <m:r>
+              <w:rPr>
+                <w:rFonts w:ascii="Cambria Math" w:eastAsiaTheme="minorEastAsia" w:hAnsi="Cambria Math" w:cs="Times New Roman"/>
+              </w:rPr>
+              <m:t>pk-pk</m:t>
+            </m:r>
+          </m:sub>
+        </m:sSub>
+      </m:oMath>
+      <w:r>
+        <w:rPr>
+          <w:rFonts w:ascii="Times New Roman" w:eastAsiaTheme="minorEastAsia" w:hAnsi="Times New Roman" w:cs="Times New Roman"/>
+        </w:rPr>
+        <w:t xml:space="preserve">, </w:t>
+      </w:r>
+      <m:oMath>
+        <m:r>
+          <w:rPr>
+            <w:rFonts w:ascii="Cambria Math" w:eastAsiaTheme="minorEastAsia" w:hAnsi="Cambria Math" w:cs="Times New Roman"/>
+          </w:rPr>
+          <m:t>R=1k</m:t>
+        </m:r>
+        <m:r>
+          <m:rPr>
+            <m:sty m:val="p"/>
+          </m:rPr>
+          <w:rPr>
+            <w:rFonts w:ascii="Cambria Math" w:eastAsiaTheme="minorEastAsia" w:hAnsi="Cambria Math" w:cs="Times New Roman"/>
+          </w:rPr>
+          <m:t>Ω</m:t>
+        </m:r>
+      </m:oMath>
+      <w:r>
+        <w:rPr>
+          <w:rFonts w:ascii="Times New Roman" w:eastAsiaTheme="minorEastAsia" w:hAnsi="Times New Roman" w:cs="Times New Roman"/>
+        </w:rPr>
+        <w:t xml:space="preserve">, and </w:t>
+      </w:r>
+      <m:oMath>
+        <m:r>
+          <w:rPr>
+            <w:rFonts w:ascii="Cambria Math" w:eastAsiaTheme="minorEastAsia" w:hAnsi="Cambria Math" w:cs="Times New Roman"/>
+          </w:rPr>
+          <m:t>C=1μF</m:t>
+        </m:r>
+      </m:oMath>
+      <w:r>
+        <w:rPr>
+          <w:rFonts w:ascii="Times New Roman" w:eastAsiaTheme="minorEastAsia" w:hAnsi="Times New Roman" w:cs="Times New Roman"/>
+        </w:rPr>
+        <w:t xml:space="preserve">. Figures 5 and 6 show the </w:t>
+      </w:r>
+      <w:r>
+        <w:rPr>
+          <w:rFonts w:ascii="Times New Roman" w:eastAsiaTheme="minorEastAsia" w:hAnsi="Times New Roman" w:cs="Times New Roman"/>
+        </w:rPr>
+        <w:t>schematics given in the lab manual for the LPF and HPF.</w:t>
+      </w:r>
+      <w:r>
+        <w:rPr>
+          <w:rFonts w:ascii="Times New Roman" w:eastAsiaTheme="minorEastAsia" w:hAnsi="Times New Roman" w:cs="Times New Roman"/>
+        </w:rPr>
+        <w:t xml:space="preserve"> Figure 7 shows the LTSpice schematic used to simulate both filters simultaneously.</w:t>
+      </w:r>
+      <w:r>
+        <w:rPr>
+          <w:rFonts w:ascii="Times New Roman" w:eastAsiaTheme="minorEastAsia" w:hAnsi="Times New Roman" w:cs="Times New Roman"/>
+        </w:rPr>
+        <w:t xml:space="preserve"> Figure 8 shows the </w:t>
+      </w:r>
+      <w:r>
+        <w:rPr>
+          <w:rFonts w:ascii="Times New Roman" w:eastAsiaTheme="minorEastAsia" w:hAnsi="Times New Roman" w:cs="Times New Roman"/>
+        </w:rPr>
+        <w:t>Bode plot for both simulated filters</w:t>
+      </w:r>
+      <w:r>
+        <w:rPr>
+          <w:rFonts w:ascii="Times New Roman" w:eastAsiaTheme="minorEastAsia" w:hAnsi="Times New Roman" w:cs="Times New Roman"/>
+        </w:rPr>
+        <w:t xml:space="preserve"> with the simulated -3dB point marked. Tables 3 and 4 show the simulation results for the LPF and HPF respectively.</w:t>
+      </w:r>
+    </w:p>
+    <w:p>
+      <w:pPr>
+        <w:spacing w:after="0" w:line="240" w:lineRule="auto"/>
+        <w:jc w:val="center"/>
+        <w:rPr>
+          <w:rFonts w:ascii="Times New Roman" w:hAnsi="Times New Roman" w:cs="Times New Roman"/>
+        </w:rPr>
+      </w:pPr>
+      <w:r>
+        <w:rPr>
+          <w:rFonts w:ascii="Times New Roman" w:hAnsi="Times New Roman" w:cs="Times New Roman"/>
+        </w:rPr>
+        <w:drawing>
+          <wp:inline distT="0" distB="0" distL="0" distR="0" wp14:anchorId="240D6B95" wp14:editId="7AE3A320">
+            <wp:extent cx="3429000" cy="2110761"/>
+            <wp:effectExtent l="19050" t="19050" r="19050" b="22860"/>
+            <wp:docPr id="1399170051" name="Picture 1"/>
+            <wp:cNvGraphicFramePr>
+              <a:graphicFrameLocks xmlns:a="http://schemas.openxmlformats.org/drawingml/2006/main" noChangeAspect="1"/>
+            </wp:cNvGraphicFramePr>
+            <a:graphic xmlns:a="http://schemas.openxmlformats.org/drawingml/2006/main">
+              <a:graphicData uri="http://schemas.openxmlformats.org/drawingml/2006/picture">
+                <pic:pic xmlns:pic="http://schemas.openxmlformats.org/drawingml/2006/picture">
+                  <pic:nvPicPr>
+                    <pic:cNvPr id="1399170051" name=""/>
+                    <pic:cNvPicPr/>
+                  </pic:nvPicPr>
+                  <pic:blipFill rotWithShape="1">
+                    <a:blip r:embed="rId8"/>
+                    <a:srcRect r="3032"/>
+                    <a:stretch>
+                      <a:fillRect/>
+                    </a:stretch>
+                  </pic:blipFill>
+                  <pic:spPr bwMode="auto">
+                    <a:xfrm>
+                      <a:off x="0" y="0"/>
+                      <a:ext cx="3429000" cy="2110761"/>
+                    </a:xfrm>
+                    <a:prstGeom prst="rect">
+                      <a:avLst/>
+                    </a:prstGeom>
+                    <a:ln w="12700" cap="flat" cmpd="sng" algn="ctr">
+                      <a:solidFill>
+                        <a:sysClr val="windowText" lastClr="000000"/>
+                      </a:solidFill>
+                      <a:prstDash val="solid"/>
+                      <a:round/>
+                      <a:headEnd type="none" w="med" len="med"/>
+                      <a:tailEnd type="none" w="med" len="med"/>
+                      <a:extLst>
+                        <a:ext uri="{C807C97D-BFC1-408E-A445-0C87EB9F89A2}">
+                          <ask:lineSketchStyleProps xmlns:ask="http://schemas.microsoft.com/office/drawing/2018/sketchyshapes" sd="0">
+                            <a:custGeom>
+                              <a:avLst/>
+                              <a:gdLst/>
+                              <a:ahLst/>
+                              <a:cxnLst/>
+                              <a:rect l="0" t="0" r="0" b="0"/>
+                              <a:pathLst/>
+                            </a:custGeom>
+                            <ask:type/>
+                          </ask:lineSketchStyleProps>
+                        </a:ext>
+                      </a:extLst>
+                    </a:ln>
+                    <a:extLst>
+                      <a:ext uri="{53640926-AAD7-44D8-BBD7-CCE9431645EC}">
+                        <a14:shadowObscured xmlns:a14="http://schemas.microsoft.com/office/drawing/2010/main"/>
+                      </a:ext>
+                    </a:extLst>
+                  </pic:spPr>
+                </pic:pic>
+              </a:graphicData>
+            </a:graphic>
+          </wp:inline>
+        </w:drawing>
+      </w:r>
+    </w:p>
+    <w:p>
+      <w:pPr>
+        <w:spacing w:after="0" w:line="480" w:lineRule="auto"/>
+        <w:jc w:val="center"/>
+        <w:rPr>
+          <w:rFonts w:ascii="Times New Roman" w:hAnsi="Times New Roman" w:cs="Times New Roman"/>
+          <w:b/>
+          <w:bCs/>
+        </w:rPr>
+      </w:pPr>
+      <w:r>
+        <w:rPr>
+          <w:rFonts w:ascii="Times New Roman" w:hAnsi="Times New Roman" w:cs="Times New Roman"/>
+          <w:b/>
+          <w:bCs/>
+        </w:rPr>
+        <w:t>Figure #5: Low Pass Filter Schematic (Lab Manual)</w:t>
+      </w:r>
+    </w:p>
+    <w:p>
+      <w:pPr>
+        <w:spacing w:after="0" w:line="240" w:lineRule="auto"/>
+        <w:jc w:val="center"/>
+        <w:rPr>
+          <w:rFonts w:ascii="Times New Roman" w:hAnsi="Times New Roman" w:cs="Times New Roman"/>
+        </w:rPr>
+      </w:pPr>
+      <w:r>
+        <w:rPr>
+          <w:rFonts w:ascii="Times New Roman" w:hAnsi="Times New Roman" w:cs="Times New Roman"/>
+        </w:rPr>
+        <w:drawing>
+          <wp:inline distT="0" distB="0" distL="0" distR="0" wp14:anchorId="3A52E057" wp14:editId="415BD0C3">
+            <wp:extent cx="3429000" cy="2196703"/>
+            <wp:effectExtent l="19050" t="19050" r="19050" b="13335"/>
+            <wp:docPr id="1509714655" name="Picture 1"/>
+            <wp:cNvGraphicFramePr>
+              <a:graphicFrameLocks xmlns:a="http://schemas.openxmlformats.org/drawingml/2006/main" noChangeAspect="1"/>
+            </wp:cNvGraphicFramePr>
+            <a:graphic xmlns:a="http://schemas.openxmlformats.org/drawingml/2006/main">
+              <a:graphicData uri="http://schemas.openxmlformats.org/drawingml/2006/picture">
+                <pic:pic xmlns:pic="http://schemas.openxmlformats.org/drawingml/2006/picture">
+                  <pic:nvPicPr>
+                    <pic:cNvPr id="1509714655" name=""/>
+                    <pic:cNvPicPr/>
+                  </pic:nvPicPr>
+                  <pic:blipFill>
+                    <a:blip r:embed="rId9"/>
+                    <a:stretch>
+                      <a:fillRect/>
+                    </a:stretch>
+                  </pic:blipFill>
+                  <pic:spPr>
+                    <a:xfrm>
+                      <a:off x="0" y="0"/>
+                      <a:ext cx="3429000" cy="2196703"/>
+                    </a:xfrm>
+                    <a:prstGeom prst="rect">
+                      <a:avLst/>
+                    </a:prstGeom>
+                    <a:ln w="12700">
+                      <a:solidFill>
+                        <a:schemeClr val="tx1"/>
+                      </a:solidFill>
+                    </a:ln>
+                  </pic:spPr>
+                </pic:pic>
+              </a:graphicData>
+            </a:graphic>
+          </wp:inline>
+        </w:drawing>
+      </w:r>
+    </w:p>
+    <w:p>
+      <w:pPr>
+        <w:spacing w:after="0" w:line="480" w:lineRule="auto"/>
+        <w:jc w:val="center"/>
+        <w:rPr>
+          <w:rFonts w:ascii="Times New Roman" w:hAnsi="Times New Roman" w:cs="Times New Roman"/>
+          <w:b/>
+          <w:bCs/>
+        </w:rPr>
+      </w:pPr>
+      <w:r>
+        <w:rPr>
+          <w:rFonts w:ascii="Times New Roman" w:hAnsi="Times New Roman" w:cs="Times New Roman"/>
+          <w:b/>
+          <w:bCs/>
+        </w:rPr>
+        <w:t>Figure #</w:t>
+      </w:r>
+      <w:r>
+        <w:rPr>
+          <w:rFonts w:ascii="Times New Roman" w:hAnsi="Times New Roman" w:cs="Times New Roman"/>
+          <w:b/>
+          <w:bCs/>
+        </w:rPr>
+        <w:t>6</w:t>
+      </w:r>
+      <w:r>
+        <w:rPr>
+          <w:rFonts w:ascii="Times New Roman" w:hAnsi="Times New Roman" w:cs="Times New Roman"/>
+          <w:b/>
+          <w:bCs/>
+        </w:rPr>
+        <w:t>: Low Pass Filter Schematic (Lab Manual)</w:t>
+      </w:r>
+    </w:p>
+    <w:p>
+      <w:pPr>
+        <w:spacing w:after="0" w:line="240" w:lineRule="auto"/>
+        <w:jc w:val="center"/>
+        <w:rPr>
+          <w:rFonts w:ascii="Times New Roman" w:hAnsi="Times New Roman" w:cs="Times New Roman"/>
+          <w:b/>
+          <w:bCs/>
+        </w:rPr>
+      </w:pPr>
+      <w:r>
+        <w:rPr>
+          <w:rFonts w:ascii="Times New Roman" w:hAnsi="Times New Roman" w:cs="Times New Roman"/>
+          <w:b/>
+          <w:bCs/>
+        </w:rPr>
+        <w:lastRenderedPageBreak/>
+        <w:drawing>
+          <wp:inline distT="0" distB="0" distL="0" distR="0" wp14:anchorId="6508C64E" wp14:editId="44A749EE">
+            <wp:extent cx="3781260" cy="3990975"/>
+            <wp:effectExtent l="19050" t="19050" r="10160" b="9525"/>
+            <wp:docPr id="81760427" name="Picture 1"/>
+            <wp:cNvGraphicFramePr>
+              <a:graphicFrameLocks xmlns:a="http://schemas.openxmlformats.org/drawingml/2006/main" noChangeAspect="1"/>
+            </wp:cNvGraphicFramePr>
+            <a:graphic xmlns:a="http://schemas.openxmlformats.org/drawingml/2006/main">
+              <a:graphicData uri="http://schemas.openxmlformats.org/drawingml/2006/picture">
+                <pic:pic xmlns:pic="http://schemas.openxmlformats.org/drawingml/2006/picture">
+                  <pic:nvPicPr>
+                    <pic:cNvPr id="81760427" name=""/>
+                    <pic:cNvPicPr/>
+                  </pic:nvPicPr>
+                  <pic:blipFill rotWithShape="1">
+                    <a:blip r:embed="rId10"/>
+                    <a:srcRect r="3645"/>
+                    <a:stretch>
+                      <a:fillRect/>
+                    </a:stretch>
+                  </pic:blipFill>
+                  <pic:spPr bwMode="auto">
+                    <a:xfrm>
+                      <a:off x="0" y="0"/>
+                      <a:ext cx="3781288" cy="3991004"/>
+                    </a:xfrm>
+                    <a:prstGeom prst="rect">
+                      <a:avLst/>
+                    </a:prstGeom>
+                    <a:ln w="12700" cap="flat" cmpd="sng" algn="ctr">
+                      <a:solidFill>
+                        <a:sysClr val="windowText" lastClr="000000"/>
+                      </a:solidFill>
+                      <a:prstDash val="solid"/>
+                      <a:round/>
+                      <a:headEnd type="none" w="med" len="med"/>
+                      <a:tailEnd type="none" w="med" len="med"/>
+                      <a:extLst>
+                        <a:ext uri="{C807C97D-BFC1-408E-A445-0C87EB9F89A2}">
+                          <ask:lineSketchStyleProps xmlns:ask="http://schemas.microsoft.com/office/drawing/2018/sketchyshapes" sd="0">
+                            <a:custGeom>
+                              <a:avLst/>
+                              <a:gdLst/>
+                              <a:ahLst/>
+                              <a:cxnLst/>
+                              <a:rect l="0" t="0" r="0" b="0"/>
+                              <a:pathLst/>
+                            </a:custGeom>
+                            <ask:type/>
+                          </ask:lineSketchStyleProps>
+                        </a:ext>
+                      </a:extLst>
+                    </a:ln>
+                    <a:extLst>
+                      <a:ext uri="{53640926-AAD7-44D8-BBD7-CCE9431645EC}">
+                        <a14:shadowObscured xmlns:a14="http://schemas.microsoft.com/office/drawing/2010/main"/>
+                      </a:ext>
+                    </a:extLst>
+                  </pic:spPr>
+                </pic:pic>
+              </a:graphicData>
+            </a:graphic>
+          </wp:inline>
+        </w:drawing>
+      </w:r>
+    </w:p>
+    <w:p>
+      <w:pPr>
+        <w:spacing w:after="0" w:line="480" w:lineRule="auto"/>
+        <w:jc w:val="center"/>
+        <w:rPr>
+          <w:rFonts w:ascii="Times New Roman" w:hAnsi="Times New Roman" w:cs="Times New Roman"/>
+          <w:b/>
+          <w:bCs/>
+        </w:rPr>
+      </w:pPr>
+      <w:r>
+        <w:rPr>
+          <w:rFonts w:ascii="Times New Roman" w:hAnsi="Times New Roman" w:cs="Times New Roman"/>
+          <w:b/>
+          <w:bCs/>
+        </w:rPr>
+        <w:t>Figure #7: LTSpice Schematic (LPF and HPF)</w:t>
+      </w:r>
+    </w:p>
+    <w:p>
+      <w:pPr>
+        <w:spacing w:after="0" w:line="240" w:lineRule="auto"/>
+        <w:ind w:left="-1440" w:right="-1260"/>
+        <w:jc w:val="center"/>
+        <w:rPr>
+          <w:rFonts w:ascii="Times New Roman" w:hAnsi="Times New Roman" w:cs="Times New Roman"/>
+          <w:b/>
+          <w:bCs/>
+        </w:rPr>
+      </w:pPr>
+      <w:r>
+        <w:rPr>
+          <w:rFonts w:ascii="Times New Roman" w:hAnsi="Times New Roman" w:cs="Times New Roman"/>
+          <w:b/>
+          <w:bCs/>
+        </w:rPr>
+        <w:drawing>
+          <wp:inline distT="0" distB="0" distL="0" distR="0" wp14:anchorId="17EA3E13" wp14:editId="7A8458F6">
+            <wp:extent cx="6630170" cy="3538741"/>
+            <wp:effectExtent l="19050" t="19050" r="18415" b="24130"/>
+            <wp:docPr id="937201664" name="Picture 1"/>
+            <wp:cNvGraphicFramePr>
+              <a:graphicFrameLocks xmlns:a="http://schemas.openxmlformats.org/drawingml/2006/main" noChangeAspect="1"/>
+            </wp:cNvGraphicFramePr>
+            <a:graphic xmlns:a="http://schemas.openxmlformats.org/drawingml/2006/main">
+              <a:graphicData uri="http://schemas.openxmlformats.org/drawingml/2006/picture">
+                <pic:pic xmlns:pic="http://schemas.openxmlformats.org/drawingml/2006/picture">
+                  <pic:nvPicPr>
+                    <pic:cNvPr id="937201664" name=""/>
+                    <pic:cNvPicPr/>
+                  </pic:nvPicPr>
+                  <pic:blipFill>
+                    <a:blip r:embed="rId11"/>
+                    <a:stretch>
+                      <a:fillRect/>
+                    </a:stretch>
+                  </pic:blipFill>
+                  <pic:spPr>
+                    <a:xfrm>
+                      <a:off x="0" y="0"/>
+                      <a:ext cx="6658767" cy="3554004"/>
+                    </a:xfrm>
+                    <a:prstGeom prst="rect">
+                      <a:avLst/>
+                    </a:prstGeom>
+                    <a:ln w="12700">
+                      <a:solidFill>
+                        <a:schemeClr val="tx1"/>
+                      </a:solidFill>
+                    </a:ln>
+                  </pic:spPr>
+                </pic:pic>
+              </a:graphicData>
+            </a:graphic>
+          </wp:inline>
+        </w:drawing>
+      </w:r>
+    </w:p>
+    <w:p>
+      <w:pPr>
+        <w:spacing w:after="0" w:line="480" w:lineRule="auto"/>
+        <w:jc w:val="center"/>
+        <w:rPr>
+          <w:rFonts w:ascii="Times New Roman" w:hAnsi="Times New Roman" w:cs="Times New Roman"/>
+          <w:b/>
+          <w:bCs/>
+        </w:rPr>
+      </w:pPr>
+      <w:r>
+        <w:rPr>
+          <w:rFonts w:ascii="Times New Roman" w:hAnsi="Times New Roman" w:cs="Times New Roman"/>
+          <w:b/>
+          <w:bCs/>
+        </w:rPr>
+        <w:t>Figure #8: LTSpice Bode Plot (LPF and HPF)</w:t>
+      </w:r>
+    </w:p>
+    <w:tbl>
+      <w:tblPr>
+        <w:tblStyle w:val="TableGrid"/>
+        <w:tblW w:w="0" w:type="auto"/>
+        <w:jc w:val="center"/>
+        <w:tblLook w:val="04A0" w:firstRow="1" w:lastRow="0" w:firstColumn="1" w:lastColumn="0" w:noHBand="0" w:noVBand="1"/>
+      </w:tblPr>
+      <w:tblGrid>
+        <w:gridCol w:w="809"/>
+        <w:gridCol w:w="1436"/>
+        <w:gridCol w:w="2545"/>
+      </w:tblGrid>
+      <w:tr>
+        <w:trPr>
+          <w:jc w:val="center"/>
+        </w:trPr>
+        <w:tc>
+          <w:tcPr>
+            <w:tcW w:w="0" w:type="auto"/>
+            <w:tcBorders>
+              <w:top w:val="nil"/>
+              <w:left w:val="nil"/>
+              <w:bottom w:val="single" w:sz="8" w:space="0" w:color="auto"/>
+              <w:right w:val="single" w:sz="8" w:space="0" w:color="auto"/>
+            </w:tcBorders>
+          </w:tcPr>
+          <w:p>
+            <w:pPr>
+              <w:jc w:val="center"/>
+              <w:rPr>
+                <w:rFonts w:ascii="Times New Roman" w:eastAsiaTheme="minorEastAsia" w:hAnsi="Times New Roman" w:cs="Times New Roman"/>
+                <w:b/>
+                <w:bCs/>
+              </w:rPr>
+            </w:pPr>
+          </w:p>
+        </w:tc>
+        <w:tc>
+          <w:tcPr>
+            <w:tcW w:w="0" w:type="auto"/>
+            <w:gridSpan w:val="2"/>
+            <w:tcBorders>
+              <w:top w:val="single" w:sz="8" w:space="0" w:color="auto"/>
+              <w:left w:val="single" w:sz="8" w:space="0" w:color="auto"/>
+              <w:bottom w:val="single" w:sz="8" w:space="0" w:color="auto"/>
+              <w:right w:val="single" w:sz="8" w:space="0" w:color="auto"/>
+            </w:tcBorders>
+          </w:tcPr>
+          <w:p>
+            <w:pPr>
+              <w:jc w:val="center"/>
+              <w:rPr>
+                <w:rFonts w:ascii="Times New Roman" w:eastAsiaTheme="minorEastAsia" w:hAnsi="Times New Roman" w:cs="Times New Roman"/>
+                <w:b/>
+                <w:bCs/>
+              </w:rPr>
+            </w:pPr>
+            <w:r>
+              <w:rPr>
+                <w:rFonts w:ascii="Times New Roman" w:eastAsiaTheme="minorEastAsia" w:hAnsi="Times New Roman" w:cs="Times New Roman"/>
+                <w:b/>
+                <w:bCs/>
+              </w:rPr>
+              <w:t>Simulation</w:t>
+            </w:r>
+          </w:p>
+        </w:tc>
+      </w:tr>
+      <w:tr>
+        <w:trPr>
+          <w:jc w:val="center"/>
+        </w:trPr>
+        <w:tc>
+          <w:tcPr>
+            <w:tcW w:w="0" w:type="auto"/>
+            <w:tcBorders>
+              <w:top w:val="single" w:sz="8" w:space="0" w:color="auto"/>
+              <w:left w:val="single" w:sz="8" w:space="0" w:color="auto"/>
+              <w:bottom w:val="single" w:sz="8" w:space="0" w:color="auto"/>
+              <w:right w:val="single" w:sz="8" w:space="0" w:color="auto"/>
+            </w:tcBorders>
+          </w:tcPr>
+          <w:p>
+            <w:pPr>
+              <w:jc w:val="center"/>
+              <w:rPr>
+                <w:rFonts w:ascii="Times New Roman" w:eastAsiaTheme="minorEastAsia" w:hAnsi="Times New Roman" w:cs="Times New Roman"/>
+                <w:b/>
+                <w:bCs/>
+              </w:rPr>
+            </w:pPr>
+            <w:r>
+              <w:rPr>
+                <w:rFonts w:ascii="Times New Roman" w:eastAsiaTheme="minorEastAsia" w:hAnsi="Times New Roman" w:cs="Times New Roman"/>
+                <w:b/>
+                <w:bCs/>
+              </w:rPr>
+              <w:t>f (Hz)</w:t>
+            </w:r>
+          </w:p>
+        </w:tc>
+        <w:tc>
+          <w:tcPr>
+            <w:tcW w:w="0" w:type="auto"/>
+            <w:tcBorders>
+              <w:top w:val="single" w:sz="8" w:space="0" w:color="auto"/>
+              <w:left w:val="single" w:sz="8" w:space="0" w:color="auto"/>
+              <w:bottom w:val="single" w:sz="8" w:space="0" w:color="auto"/>
+              <w:right w:val="single" w:sz="8" w:space="0" w:color="auto"/>
+            </w:tcBorders>
+          </w:tcPr>
+          <w:p>
+            <w:pPr>
+              <w:jc w:val="center"/>
+              <w:rPr>
+                <w:rFonts w:ascii="Times New Roman" w:eastAsiaTheme="minorEastAsia" w:hAnsi="Times New Roman" w:cs="Times New Roman"/>
+                <w:b/>
+                <w:bCs/>
+              </w:rPr>
+            </w:pPr>
+            <w:r>
+              <w:rPr>
+                <w:rFonts w:ascii="Times New Roman" w:eastAsiaTheme="minorEastAsia" w:hAnsi="Times New Roman" w:cs="Times New Roman"/>
+                <w:b/>
+                <w:bCs/>
+              </w:rPr>
+              <w:t>Gain (dB)</w:t>
+            </w:r>
+          </w:p>
+        </w:tc>
+        <w:tc>
+          <w:tcPr>
+            <w:tcW w:w="0" w:type="auto"/>
+            <w:tcBorders>
+              <w:top w:val="single" w:sz="8" w:space="0" w:color="auto"/>
+              <w:left w:val="single" w:sz="8" w:space="0" w:color="auto"/>
+              <w:bottom w:val="single" w:sz="8" w:space="0" w:color="auto"/>
+              <w:right w:val="single" w:sz="8" w:space="0" w:color="auto"/>
+            </w:tcBorders>
+          </w:tcPr>
+          <w:p>
+            <w:pPr>
+              <w:jc w:val="center"/>
+              <w:rPr>
+                <w:rFonts w:ascii="Times New Roman" w:eastAsiaTheme="minorEastAsia" w:hAnsi="Times New Roman" w:cs="Times New Roman"/>
+                <w:b/>
+                <w:bCs/>
+              </w:rPr>
+            </w:pPr>
+            <w:r>
+              <w:rPr>
+                <w:rFonts w:ascii="Times New Roman" w:eastAsiaTheme="minorEastAsia" w:hAnsi="Times New Roman" w:cs="Times New Roman"/>
+                <w:b/>
+                <w:bCs/>
+              </w:rPr>
+              <w:t>Phase Angles (degrees)</w:t>
+            </w:r>
+          </w:p>
+        </w:tc>
+      </w:tr>
+      <w:tr>
+        <w:trPr>
+          <w:jc w:val="center"/>
+        </w:trPr>
+        <w:tc>
+          <w:tcPr>
+            <w:tcW w:w="0" w:type="auto"/>
+            <w:tcBorders>
+              <w:top w:val="single" w:sz="8" w:space="0" w:color="auto"/>
+              <w:left w:val="single" w:sz="8" w:space="0" w:color="auto"/>
+              <w:right w:val="single" w:sz="8" w:space="0" w:color="auto"/>
+            </w:tcBorders>
+          </w:tcPr>
+          <w:p>
+            <w:pPr>
+              <w:jc w:val="center"/>
+              <w:rPr>
+                <w:rFonts w:ascii="Times New Roman" w:eastAsiaTheme="minorEastAsia" w:hAnsi="Times New Roman" w:cs="Times New Roman"/>
+              </w:rPr>
+            </w:pPr>
+            <w:r>
+              <w:rPr>
+                <w:rFonts w:ascii="Times New Roman" w:eastAsiaTheme="minorEastAsia" w:hAnsi="Times New Roman" w:cs="Times New Roman"/>
+              </w:rPr>
+              <w:t>25</w:t>
+            </w:r>
+          </w:p>
+        </w:tc>
+        <w:tc>
+          <w:tcPr>
+            <w:tcW w:w="0" w:type="auto"/>
+            <w:tcBorders>
+              <w:top w:val="single" w:sz="8" w:space="0" w:color="auto"/>
+              <w:left w:val="single" w:sz="8" w:space="0" w:color="auto"/>
+              <w:right w:val="single" w:sz="8" w:space="0" w:color="auto"/>
+            </w:tcBorders>
+          </w:tcPr>
+          <w:p>
+            <w:pPr>
+              <w:jc w:val="center"/>
+              <w:rPr>
+                <w:rFonts w:ascii="Times New Roman" w:eastAsiaTheme="minorEastAsia" w:hAnsi="Times New Roman" w:cs="Times New Roman"/>
+              </w:rPr>
+            </w:pPr>
+            <w:r>
+              <w:rPr>
+                <w:rFonts w:ascii="Times New Roman" w:eastAsiaTheme="minorEastAsia" w:hAnsi="Times New Roman" w:cs="Times New Roman"/>
+              </w:rPr>
+              <w:t>-</w:t>
+            </w:r>
+            <w:r>
+              <w:rPr>
+                <w:rFonts w:ascii="Times New Roman" w:eastAsiaTheme="minorEastAsia" w:hAnsi="Times New Roman" w:cs="Times New Roman"/>
+              </w:rPr>
+              <w:t>0.10586154</w:t>
+            </w:r>
+          </w:p>
+        </w:tc>
+        <w:tc>
+          <w:tcPr>
+            <w:tcW w:w="0" w:type="auto"/>
+            <w:tcBorders>
+              <w:top w:val="single" w:sz="8" w:space="0" w:color="auto"/>
+              <w:left w:val="single" w:sz="8" w:space="0" w:color="auto"/>
+              <w:right w:val="single" w:sz="8" w:space="0" w:color="auto"/>
+            </w:tcBorders>
+          </w:tcPr>
+          <w:p>
+            <w:pPr>
+              <w:jc w:val="center"/>
+              <w:rPr>
+                <w:rFonts w:ascii="Times New Roman" w:eastAsiaTheme="minorEastAsia" w:hAnsi="Times New Roman" w:cs="Times New Roman"/>
+              </w:rPr>
+            </w:pPr>
+            <w:r>
+              <w:rPr>
+                <w:rFonts w:ascii="Times New Roman" w:eastAsiaTheme="minorEastAsia" w:hAnsi="Times New Roman" w:cs="Times New Roman"/>
+              </w:rPr>
+              <w:t>-8.9271434</w:t>
+            </w:r>
+          </w:p>
+        </w:tc>
+      </w:tr>
+      <w:tr>
+        <w:trPr>
+          <w:jc w:val="center"/>
+        </w:trPr>
+        <w:tc>
+          <w:tcPr>
+            <w:tcW w:w="0" w:type="auto"/>
+            <w:tcBorders>
+              <w:left w:val="single" w:sz="8" w:space="0" w:color="auto"/>
+              <w:right w:val="single" w:sz="8" w:space="0" w:color="auto"/>
+            </w:tcBorders>
+          </w:tcPr>
+          <w:p>
+            <w:pPr>
+              <w:jc w:val="center"/>
+              <w:rPr>
+                <w:rFonts w:ascii="Times New Roman" w:eastAsiaTheme="minorEastAsia" w:hAnsi="Times New Roman" w:cs="Times New Roman"/>
+              </w:rPr>
+            </w:pPr>
+            <w:r>
+              <w:rPr>
+                <w:rFonts w:ascii="Times New Roman" w:eastAsiaTheme="minorEastAsia" w:hAnsi="Times New Roman" w:cs="Times New Roman"/>
+              </w:rPr>
+              <w:t>50</w:t>
+            </w:r>
+          </w:p>
+        </w:tc>
+        <w:tc>
+          <w:tcPr>
+            <w:tcW w:w="0" w:type="auto"/>
+            <w:tcBorders>
+              <w:left w:val="single" w:sz="8" w:space="0" w:color="auto"/>
+              <w:right w:val="single" w:sz="8" w:space="0" w:color="auto"/>
+            </w:tcBorders>
+          </w:tcPr>
+          <w:p>
+            <w:pPr>
+              <w:jc w:val="center"/>
+              <w:rPr>
+                <w:rFonts w:ascii="Times New Roman" w:eastAsiaTheme="minorEastAsia" w:hAnsi="Times New Roman" w:cs="Times New Roman"/>
+              </w:rPr>
+            </w:pPr>
+            <w:r>
+              <w:rPr>
+                <w:rFonts w:ascii="Times New Roman" w:eastAsiaTheme="minorEastAsia" w:hAnsi="Times New Roman" w:cs="Times New Roman"/>
+              </w:rPr>
+              <w:t>-0.4087871</w:t>
+            </w:r>
+          </w:p>
+        </w:tc>
+        <w:tc>
+          <w:tcPr>
+            <w:tcW w:w="0" w:type="auto"/>
+            <w:tcBorders>
+              <w:left w:val="single" w:sz="8" w:space="0" w:color="auto"/>
+              <w:right w:val="single" w:sz="8" w:space="0" w:color="auto"/>
+            </w:tcBorders>
+          </w:tcPr>
+          <w:p>
+            <w:pPr>
+              <w:jc w:val="center"/>
+              <w:rPr>
+                <w:rFonts w:ascii="Times New Roman" w:eastAsiaTheme="minorEastAsia" w:hAnsi="Times New Roman" w:cs="Times New Roman"/>
+              </w:rPr>
+            </w:pPr>
+            <w:r>
+              <w:rPr>
+                <w:rFonts w:ascii="Times New Roman" w:eastAsiaTheme="minorEastAsia" w:hAnsi="Times New Roman" w:cs="Times New Roman"/>
+              </w:rPr>
+              <w:t>-17.440703</w:t>
+            </w:r>
+          </w:p>
+        </w:tc>
+      </w:tr>
+      <w:tr>
+        <w:trPr>
+          <w:jc w:val="center"/>
+        </w:trPr>
+        <w:tc>
+          <w:tcPr>
+            <w:tcW w:w="0" w:type="auto"/>
+            <w:tcBorders>
+              <w:left w:val="single" w:sz="8" w:space="0" w:color="auto"/>
+              <w:right w:val="single" w:sz="8" w:space="0" w:color="auto"/>
+            </w:tcBorders>
+          </w:tcPr>
+          <w:p>
+            <w:pPr>
+              <w:jc w:val="center"/>
+              <w:rPr>
+                <w:rFonts w:ascii="Times New Roman" w:eastAsiaTheme="minorEastAsia" w:hAnsi="Times New Roman" w:cs="Times New Roman"/>
+              </w:rPr>
+            </w:pPr>
+            <w:r>
+              <w:rPr>
+                <w:rFonts w:ascii="Times New Roman" w:eastAsiaTheme="minorEastAsia" w:hAnsi="Times New Roman" w:cs="Times New Roman"/>
+              </w:rPr>
+              <w:t>75</w:t>
+            </w:r>
+          </w:p>
+        </w:tc>
+        <w:tc>
+          <w:tcPr>
+            <w:tcW w:w="0" w:type="auto"/>
+            <w:tcBorders>
+              <w:left w:val="single" w:sz="8" w:space="0" w:color="auto"/>
+              <w:right w:val="single" w:sz="8" w:space="0" w:color="auto"/>
+            </w:tcBorders>
+          </w:tcPr>
+          <w:p>
+            <w:pPr>
+              <w:jc w:val="center"/>
+              <w:rPr>
+                <w:rFonts w:ascii="Times New Roman" w:eastAsiaTheme="minorEastAsia" w:hAnsi="Times New Roman" w:cs="Times New Roman"/>
+              </w:rPr>
+            </w:pPr>
+            <w:r>
+              <w:rPr>
+                <w:rFonts w:ascii="Times New Roman" w:eastAsiaTheme="minorEastAsia" w:hAnsi="Times New Roman" w:cs="Times New Roman"/>
+              </w:rPr>
+              <w:t>-0.8709666</w:t>
+            </w:r>
+          </w:p>
+        </w:tc>
+        <w:tc>
+          <w:tcPr>
+            <w:tcW w:w="0" w:type="auto"/>
+            <w:tcBorders>
+              <w:left w:val="single" w:sz="8" w:space="0" w:color="auto"/>
+              <w:right w:val="single" w:sz="8" w:space="0" w:color="auto"/>
+            </w:tcBorders>
+          </w:tcPr>
+          <w:p>
+            <w:pPr>
+              <w:jc w:val="center"/>
+              <w:rPr>
+                <w:rFonts w:ascii="Times New Roman" w:eastAsiaTheme="minorEastAsia" w:hAnsi="Times New Roman" w:cs="Times New Roman"/>
+              </w:rPr>
+            </w:pPr>
+            <w:r>
+              <w:rPr>
+                <w:rFonts w:ascii="Times New Roman" w:eastAsiaTheme="minorEastAsia" w:hAnsi="Times New Roman" w:cs="Times New Roman"/>
+              </w:rPr>
+              <w:t>-25.231744</w:t>
+            </w:r>
+          </w:p>
+        </w:tc>
+      </w:tr>
+      <w:tr>
+        <w:trPr>
+          <w:jc w:val="center"/>
+        </w:trPr>
+        <w:tc>
+          <w:tcPr>
+            <w:tcW w:w="0" w:type="auto"/>
+            <w:tcBorders>
+              <w:left w:val="single" w:sz="8" w:space="0" w:color="auto"/>
+              <w:right w:val="single" w:sz="8" w:space="0" w:color="auto"/>
+            </w:tcBorders>
+          </w:tcPr>
+          <w:p>
+            <w:pPr>
+              <w:jc w:val="center"/>
+              <w:rPr>
+                <w:rFonts w:ascii="Times New Roman" w:eastAsiaTheme="minorEastAsia" w:hAnsi="Times New Roman" w:cs="Times New Roman"/>
+              </w:rPr>
+            </w:pPr>
+            <w:r>
+              <w:rPr>
+                <w:rFonts w:ascii="Times New Roman" w:eastAsiaTheme="minorEastAsia" w:hAnsi="Times New Roman" w:cs="Times New Roman"/>
+              </w:rPr>
+              <w:t>100</w:t>
+            </w:r>
+          </w:p>
+        </w:tc>
+        <w:tc>
+          <w:tcPr>
+            <w:tcW w:w="0" w:type="auto"/>
+            <w:tcBorders>
+              <w:left w:val="single" w:sz="8" w:space="0" w:color="auto"/>
+              <w:right w:val="single" w:sz="8" w:space="0" w:color="auto"/>
+            </w:tcBorders>
+          </w:tcPr>
+          <w:p>
+            <w:pPr>
+              <w:jc w:val="center"/>
+              <w:rPr>
+                <w:rFonts w:ascii="Times New Roman" w:eastAsiaTheme="minorEastAsia" w:hAnsi="Times New Roman" w:cs="Times New Roman"/>
+              </w:rPr>
+            </w:pPr>
+            <w:r>
+              <w:rPr>
+                <w:rFonts w:ascii="Times New Roman" w:eastAsiaTheme="minorEastAsia" w:hAnsi="Times New Roman" w:cs="Times New Roman"/>
+              </w:rPr>
+              <w:t>-1.4450701</w:t>
+            </w:r>
+          </w:p>
+        </w:tc>
+        <w:tc>
+          <w:tcPr>
+            <w:tcW w:w="0" w:type="auto"/>
+            <w:tcBorders>
+              <w:left w:val="single" w:sz="8" w:space="0" w:color="auto"/>
+              <w:right w:val="single" w:sz="8" w:space="0" w:color="auto"/>
+            </w:tcBorders>
+          </w:tcPr>
+          <w:p>
+            <w:pPr>
+              <w:jc w:val="center"/>
+              <w:rPr>
+                <w:rFonts w:ascii="Times New Roman" w:eastAsiaTheme="minorEastAsia" w:hAnsi="Times New Roman" w:cs="Times New Roman"/>
+              </w:rPr>
+            </w:pPr>
+            <w:r>
+              <w:rPr>
+                <w:rFonts w:ascii="Times New Roman" w:eastAsiaTheme="minorEastAsia" w:hAnsi="Times New Roman" w:cs="Times New Roman"/>
+              </w:rPr>
+              <w:t>-32.141908</w:t>
+            </w:r>
+          </w:p>
+        </w:tc>
+      </w:tr>
+      <w:tr>
+        <w:trPr>
+          <w:jc w:val="center"/>
+        </w:trPr>
+        <w:tc>
+          <w:tcPr>
+            <w:tcW w:w="0" w:type="auto"/>
+            <w:tcBorders>
+              <w:left w:val="single" w:sz="8" w:space="0" w:color="auto"/>
+              <w:right w:val="single" w:sz="8" w:space="0" w:color="auto"/>
+            </w:tcBorders>
+          </w:tcPr>
+          <w:p>
+            <w:pPr>
+              <w:jc w:val="center"/>
+              <w:rPr>
+                <w:rFonts w:ascii="Times New Roman" w:eastAsiaTheme="minorEastAsia" w:hAnsi="Times New Roman" w:cs="Times New Roman"/>
+              </w:rPr>
+            </w:pPr>
+            <w:r>
+              <w:rPr>
+                <w:rFonts w:ascii="Times New Roman" w:eastAsiaTheme="minorEastAsia" w:hAnsi="Times New Roman" w:cs="Times New Roman"/>
+              </w:rPr>
+              <w:t>150</w:t>
+            </w:r>
+          </w:p>
+        </w:tc>
+        <w:tc>
+          <w:tcPr>
+            <w:tcW w:w="0" w:type="auto"/>
+            <w:tcBorders>
+              <w:left w:val="single" w:sz="8" w:space="0" w:color="auto"/>
+              <w:right w:val="single" w:sz="8" w:space="0" w:color="auto"/>
+            </w:tcBorders>
+          </w:tcPr>
+          <w:p>
+            <w:pPr>
+              <w:jc w:val="center"/>
+              <w:rPr>
+                <w:rFonts w:ascii="Times New Roman" w:eastAsiaTheme="minorEastAsia" w:hAnsi="Times New Roman" w:cs="Times New Roman"/>
+              </w:rPr>
+            </w:pPr>
+            <w:r>
+              <w:rPr>
+                <w:rFonts w:ascii="Times New Roman" w:eastAsiaTheme="minorEastAsia" w:hAnsi="Times New Roman" w:cs="Times New Roman"/>
+              </w:rPr>
+              <w:t>-2.7606321</w:t>
+            </w:r>
+          </w:p>
+        </w:tc>
+        <w:tc>
+          <w:tcPr>
+            <w:tcW w:w="0" w:type="auto"/>
+            <w:tcBorders>
+              <w:left w:val="single" w:sz="8" w:space="0" w:color="auto"/>
+              <w:right w:val="single" w:sz="8" w:space="0" w:color="auto"/>
+            </w:tcBorders>
+          </w:tcPr>
+          <w:p>
+            <w:pPr>
+              <w:jc w:val="center"/>
+              <w:rPr>
+                <w:rFonts w:ascii="Times New Roman" w:eastAsiaTheme="minorEastAsia" w:hAnsi="Times New Roman" w:cs="Times New Roman"/>
+              </w:rPr>
+            </w:pPr>
+            <w:r>
+              <w:rPr>
+                <w:rFonts w:ascii="Times New Roman" w:eastAsiaTheme="minorEastAsia" w:hAnsi="Times New Roman" w:cs="Times New Roman"/>
+              </w:rPr>
+              <w:t>-43.303809</w:t>
+            </w:r>
+          </w:p>
+        </w:tc>
+      </w:tr>
+      <w:tr>
+        <w:trPr>
+          <w:jc w:val="center"/>
+        </w:trPr>
+        <w:tc>
+          <w:tcPr>
+            <w:tcW w:w="0" w:type="auto"/>
+            <w:tcBorders>
+              <w:left w:val="single" w:sz="8" w:space="0" w:color="auto"/>
+              <w:right w:val="single" w:sz="8" w:space="0" w:color="auto"/>
+            </w:tcBorders>
+          </w:tcPr>
+          <w:p>
+            <w:pPr>
+              <w:jc w:val="center"/>
+              <w:rPr>
+                <w:rFonts w:ascii="Times New Roman" w:eastAsiaTheme="minorEastAsia" w:hAnsi="Times New Roman" w:cs="Times New Roman"/>
+              </w:rPr>
+            </w:pPr>
+            <w:r>
+              <w:rPr>
+                <w:rFonts w:ascii="Times New Roman" w:eastAsiaTheme="minorEastAsia" w:hAnsi="Times New Roman" w:cs="Times New Roman"/>
+              </w:rPr>
+              <w:t>200</w:t>
+            </w:r>
+          </w:p>
+        </w:tc>
+        <w:tc>
+          <w:tcPr>
+            <w:tcW w:w="0" w:type="auto"/>
+            <w:tcBorders>
+              <w:left w:val="single" w:sz="8" w:space="0" w:color="auto"/>
+              <w:right w:val="single" w:sz="8" w:space="0" w:color="auto"/>
+            </w:tcBorders>
+          </w:tcPr>
+          <w:p>
+            <w:pPr>
+              <w:jc w:val="center"/>
+              <w:rPr>
+                <w:rFonts w:ascii="Times New Roman" w:eastAsiaTheme="minorEastAsia" w:hAnsi="Times New Roman" w:cs="Times New Roman"/>
+              </w:rPr>
+            </w:pPr>
+            <w:r>
+              <w:rPr>
+                <w:rFonts w:ascii="Times New Roman" w:eastAsiaTheme="minorEastAsia" w:hAnsi="Times New Roman" w:cs="Times New Roman"/>
+              </w:rPr>
+              <w:t>-4.114777</w:t>
+            </w:r>
+          </w:p>
+        </w:tc>
+        <w:tc>
+          <w:tcPr>
+            <w:tcW w:w="0" w:type="auto"/>
+            <w:tcBorders>
+              <w:left w:val="single" w:sz="8" w:space="0" w:color="auto"/>
+              <w:right w:val="single" w:sz="8" w:space="0" w:color="auto"/>
+            </w:tcBorders>
+          </w:tcPr>
+          <w:p>
+            <w:pPr>
+              <w:jc w:val="center"/>
+              <w:rPr>
+                <w:rFonts w:ascii="Times New Roman" w:eastAsiaTheme="minorEastAsia" w:hAnsi="Times New Roman" w:cs="Times New Roman"/>
+              </w:rPr>
+            </w:pPr>
+            <w:r>
+              <w:rPr>
+                <w:rFonts w:ascii="Times New Roman" w:eastAsiaTheme="minorEastAsia" w:hAnsi="Times New Roman" w:cs="Times New Roman"/>
+              </w:rPr>
+              <w:t>-51.488062</w:t>
+            </w:r>
+          </w:p>
+        </w:tc>
+      </w:tr>
+      <w:tr>
+        <w:trPr>
+          <w:jc w:val="center"/>
+        </w:trPr>
+        <w:tc>
+          <w:tcPr>
+            <w:tcW w:w="0" w:type="auto"/>
+            <w:tcBorders>
+              <w:left w:val="single" w:sz="8" w:space="0" w:color="auto"/>
+              <w:right w:val="single" w:sz="8" w:space="0" w:color="auto"/>
+            </w:tcBorders>
+          </w:tcPr>
+          <w:p>
+            <w:pPr>
+              <w:jc w:val="center"/>
+              <w:rPr>
+                <w:rFonts w:ascii="Times New Roman" w:eastAsiaTheme="minorEastAsia" w:hAnsi="Times New Roman" w:cs="Times New Roman"/>
+              </w:rPr>
+            </w:pPr>
+            <w:r>
+              <w:rPr>
+                <w:rFonts w:ascii="Times New Roman" w:eastAsiaTheme="minorEastAsia" w:hAnsi="Times New Roman" w:cs="Times New Roman"/>
+              </w:rPr>
+              <w:t>300</w:t>
+            </w:r>
+          </w:p>
+        </w:tc>
+        <w:tc>
+          <w:tcPr>
+            <w:tcW w:w="0" w:type="auto"/>
+            <w:tcBorders>
+              <w:left w:val="single" w:sz="8" w:space="0" w:color="auto"/>
+              <w:right w:val="single" w:sz="8" w:space="0" w:color="auto"/>
+            </w:tcBorders>
+          </w:tcPr>
+          <w:p>
+            <w:pPr>
+              <w:jc w:val="center"/>
+              <w:rPr>
+                <w:rFonts w:ascii="Times New Roman" w:eastAsiaTheme="minorEastAsia" w:hAnsi="Times New Roman" w:cs="Times New Roman"/>
+              </w:rPr>
+            </w:pPr>
+            <w:r>
+              <w:rPr>
+                <w:rFonts w:ascii="Times New Roman" w:eastAsiaTheme="minorEastAsia" w:hAnsi="Times New Roman" w:cs="Times New Roman"/>
+              </w:rPr>
+              <w:t>-6.5830569</w:t>
+            </w:r>
+          </w:p>
+        </w:tc>
+        <w:tc>
+          <w:tcPr>
+            <w:tcW w:w="0" w:type="auto"/>
+            <w:tcBorders>
+              <w:left w:val="single" w:sz="8" w:space="0" w:color="auto"/>
+              <w:right w:val="single" w:sz="8" w:space="0" w:color="auto"/>
+            </w:tcBorders>
+          </w:tcPr>
+          <w:p>
+            <w:pPr>
+              <w:jc w:val="center"/>
+              <w:rPr>
+                <w:rFonts w:ascii="Times New Roman" w:eastAsiaTheme="minorEastAsia" w:hAnsi="Times New Roman" w:cs="Times New Roman"/>
+              </w:rPr>
+            </w:pPr>
+            <w:r>
+              <w:rPr>
+                <w:rFonts w:ascii="Times New Roman" w:eastAsiaTheme="minorEastAsia" w:hAnsi="Times New Roman" w:cs="Times New Roman"/>
+              </w:rPr>
+              <w:t>-62.053199</w:t>
+            </w:r>
+          </w:p>
+        </w:tc>
+      </w:tr>
+      <w:tr>
+        <w:trPr>
+          <w:jc w:val="center"/>
+        </w:trPr>
+        <w:tc>
+          <w:tcPr>
+            <w:tcW w:w="0" w:type="auto"/>
+            <w:tcBorders>
+              <w:left w:val="single" w:sz="8" w:space="0" w:color="auto"/>
+              <w:right w:val="single" w:sz="8" w:space="0" w:color="auto"/>
+            </w:tcBorders>
+          </w:tcPr>
+          <w:p>
+            <w:pPr>
+              <w:jc w:val="center"/>
+              <w:rPr>
+                <w:rFonts w:ascii="Times New Roman" w:eastAsiaTheme="minorEastAsia" w:hAnsi="Times New Roman" w:cs="Times New Roman"/>
+              </w:rPr>
+            </w:pPr>
+            <w:r>
+              <w:rPr>
+                <w:rFonts w:ascii="Times New Roman" w:eastAsiaTheme="minorEastAsia" w:hAnsi="Times New Roman" w:cs="Times New Roman"/>
+              </w:rPr>
+              <w:t>500</w:t>
+            </w:r>
+          </w:p>
+        </w:tc>
+        <w:tc>
+          <w:tcPr>
+            <w:tcW w:w="0" w:type="auto"/>
+            <w:tcBorders>
+              <w:left w:val="single" w:sz="8" w:space="0" w:color="auto"/>
+              <w:right w:val="single" w:sz="8" w:space="0" w:color="auto"/>
+            </w:tcBorders>
+          </w:tcPr>
+          <w:p>
+            <w:pPr>
+              <w:jc w:val="center"/>
+              <w:rPr>
+                <w:rFonts w:ascii="Times New Roman" w:eastAsiaTheme="minorEastAsia" w:hAnsi="Times New Roman" w:cs="Times New Roman"/>
+              </w:rPr>
+            </w:pPr>
+            <w:r>
+              <w:rPr>
+                <w:rFonts w:ascii="Times New Roman" w:eastAsiaTheme="minorEastAsia" w:hAnsi="Times New Roman" w:cs="Times New Roman"/>
+              </w:rPr>
+              <w:t>-10.362149</w:t>
+            </w:r>
+          </w:p>
+        </w:tc>
+        <w:tc>
+          <w:tcPr>
+            <w:tcW w:w="0" w:type="auto"/>
+            <w:tcBorders>
+              <w:left w:val="single" w:sz="8" w:space="0" w:color="auto"/>
+              <w:right w:val="single" w:sz="8" w:space="0" w:color="auto"/>
+            </w:tcBorders>
+          </w:tcPr>
+          <w:p>
+            <w:pPr>
+              <w:jc w:val="center"/>
+              <w:rPr>
+                <w:rFonts w:ascii="Times New Roman" w:eastAsiaTheme="minorEastAsia" w:hAnsi="Times New Roman" w:cs="Times New Roman"/>
+              </w:rPr>
+            </w:pPr>
+            <w:r>
+              <w:rPr>
+                <w:rFonts w:ascii="Times New Roman" w:eastAsiaTheme="minorEastAsia" w:hAnsi="Times New Roman" w:cs="Times New Roman"/>
+              </w:rPr>
+              <w:t>-72.343103</w:t>
+            </w:r>
+          </w:p>
+        </w:tc>
+      </w:tr>
+      <w:tr>
+        <w:trPr>
+          <w:jc w:val="center"/>
+        </w:trPr>
+        <w:tc>
+          <w:tcPr>
+            <w:tcW w:w="0" w:type="auto"/>
+            <w:tcBorders>
+              <w:left w:val="single" w:sz="8" w:space="0" w:color="auto"/>
+              <w:right w:val="single" w:sz="8" w:space="0" w:color="auto"/>
+            </w:tcBorders>
+          </w:tcPr>
+          <w:p>
+            <w:pPr>
+              <w:jc w:val="center"/>
+              <w:rPr>
+                <w:rFonts w:ascii="Times New Roman" w:eastAsiaTheme="minorEastAsia" w:hAnsi="Times New Roman" w:cs="Times New Roman"/>
+              </w:rPr>
+            </w:pPr>
+            <w:r>
+              <w:rPr>
+                <w:rFonts w:ascii="Times New Roman" w:eastAsiaTheme="minorEastAsia" w:hAnsi="Times New Roman" w:cs="Times New Roman"/>
+              </w:rPr>
+              <w:t>600</w:t>
+            </w:r>
+          </w:p>
+        </w:tc>
+        <w:tc>
+          <w:tcPr>
+            <w:tcW w:w="0" w:type="auto"/>
+            <w:tcBorders>
+              <w:left w:val="single" w:sz="8" w:space="0" w:color="auto"/>
+              <w:right w:val="single" w:sz="8" w:space="0" w:color="auto"/>
+            </w:tcBorders>
+          </w:tcPr>
+          <w:p>
+            <w:pPr>
+              <w:jc w:val="center"/>
+              <w:rPr>
+                <w:rFonts w:ascii="Times New Roman" w:eastAsiaTheme="minorEastAsia" w:hAnsi="Times New Roman" w:cs="Times New Roman"/>
+              </w:rPr>
+            </w:pPr>
+            <w:r>
+              <w:rPr>
+                <w:rFonts w:ascii="Times New Roman" w:eastAsiaTheme="minorEastAsia" w:hAnsi="Times New Roman" w:cs="Times New Roman"/>
+              </w:rPr>
+              <w:t>-11.82194</w:t>
+            </w:r>
+          </w:p>
+        </w:tc>
+        <w:tc>
+          <w:tcPr>
+            <w:tcW w:w="0" w:type="auto"/>
+            <w:tcBorders>
+              <w:left w:val="single" w:sz="8" w:space="0" w:color="auto"/>
+              <w:right w:val="single" w:sz="8" w:space="0" w:color="auto"/>
+            </w:tcBorders>
+          </w:tcPr>
+          <w:p>
+            <w:pPr>
+              <w:jc w:val="center"/>
+              <w:rPr>
+                <w:rFonts w:ascii="Times New Roman" w:eastAsiaTheme="minorEastAsia" w:hAnsi="Times New Roman" w:cs="Times New Roman"/>
+              </w:rPr>
+            </w:pPr>
+            <w:r>
+              <w:rPr>
+                <w:rFonts w:ascii="Times New Roman" w:eastAsiaTheme="minorEastAsia" w:hAnsi="Times New Roman" w:cs="Times New Roman"/>
+              </w:rPr>
+              <w:t>-75.143819</w:t>
+            </w:r>
+          </w:p>
+        </w:tc>
+      </w:tr>
+      <w:tr>
+        <w:trPr>
+          <w:jc w:val="center"/>
+        </w:trPr>
+        <w:tc>
+          <w:tcPr>
+            <w:tcW w:w="0" w:type="auto"/>
+            <w:tcBorders>
+              <w:left w:val="single" w:sz="8" w:space="0" w:color="auto"/>
+              <w:right w:val="single" w:sz="8" w:space="0" w:color="auto"/>
+            </w:tcBorders>
+          </w:tcPr>
+          <w:p>
+            <w:pPr>
+              <w:jc w:val="center"/>
+              <w:rPr>
+                <w:rFonts w:ascii="Times New Roman" w:eastAsiaTheme="minorEastAsia" w:hAnsi="Times New Roman" w:cs="Times New Roman"/>
+              </w:rPr>
+            </w:pPr>
+            <w:r>
+              <w:rPr>
+                <w:rFonts w:ascii="Times New Roman" w:eastAsiaTheme="minorEastAsia" w:hAnsi="Times New Roman" w:cs="Times New Roman"/>
+              </w:rPr>
+              <w:t>700</w:t>
+            </w:r>
+          </w:p>
+        </w:tc>
+        <w:tc>
+          <w:tcPr>
+            <w:tcW w:w="0" w:type="auto"/>
+            <w:tcBorders>
+              <w:left w:val="single" w:sz="8" w:space="0" w:color="auto"/>
+              <w:right w:val="single" w:sz="8" w:space="0" w:color="auto"/>
+            </w:tcBorders>
+          </w:tcPr>
+          <w:p>
+            <w:pPr>
+              <w:jc w:val="center"/>
+              <w:rPr>
+                <w:rFonts w:ascii="Times New Roman" w:eastAsiaTheme="minorEastAsia" w:hAnsi="Times New Roman" w:cs="Times New Roman"/>
+              </w:rPr>
+            </w:pPr>
+            <w:r>
+              <w:rPr>
+                <w:rFonts w:ascii="Times New Roman" w:eastAsiaTheme="minorEastAsia" w:hAnsi="Times New Roman" w:cs="Times New Roman"/>
+              </w:rPr>
+              <w:t>-13.084461</w:t>
+            </w:r>
+          </w:p>
+        </w:tc>
+        <w:tc>
+          <w:tcPr>
+            <w:tcW w:w="0" w:type="auto"/>
+            <w:tcBorders>
+              <w:left w:val="single" w:sz="8" w:space="0" w:color="auto"/>
+              <w:right w:val="single" w:sz="8" w:space="0" w:color="auto"/>
+            </w:tcBorders>
+          </w:tcPr>
+          <w:p>
+            <w:pPr>
+              <w:jc w:val="center"/>
+              <w:rPr>
+                <w:rFonts w:ascii="Times New Roman" w:eastAsiaTheme="minorEastAsia" w:hAnsi="Times New Roman" w:cs="Times New Roman"/>
+              </w:rPr>
+            </w:pPr>
+            <w:r>
+              <w:rPr>
+                <w:rFonts w:ascii="Times New Roman" w:eastAsiaTheme="minorEastAsia" w:hAnsi="Times New Roman" w:cs="Times New Roman"/>
+              </w:rPr>
+              <w:t>-77.190656</w:t>
+            </w:r>
+          </w:p>
+        </w:tc>
+      </w:tr>
+      <w:tr>
+        <w:trPr>
+          <w:jc w:val="center"/>
+        </w:trPr>
+        <w:tc>
+          <w:tcPr>
+            <w:tcW w:w="0" w:type="auto"/>
+            <w:tcBorders>
+              <w:left w:val="single" w:sz="8" w:space="0" w:color="auto"/>
+              <w:right w:val="single" w:sz="8" w:space="0" w:color="auto"/>
+            </w:tcBorders>
+          </w:tcPr>
+          <w:p>
+            <w:pPr>
+              <w:jc w:val="center"/>
+              <w:rPr>
+                <w:rFonts w:ascii="Times New Roman" w:eastAsiaTheme="minorEastAsia" w:hAnsi="Times New Roman" w:cs="Times New Roman"/>
+              </w:rPr>
+            </w:pPr>
+            <w:r>
+              <w:rPr>
+                <w:rFonts w:ascii="Times New Roman" w:eastAsiaTheme="minorEastAsia" w:hAnsi="Times New Roman" w:cs="Times New Roman"/>
+              </w:rPr>
+              <w:t>800</w:t>
+            </w:r>
+          </w:p>
+        </w:tc>
+        <w:tc>
+          <w:tcPr>
+            <w:tcW w:w="0" w:type="auto"/>
+            <w:tcBorders>
+              <w:left w:val="single" w:sz="8" w:space="0" w:color="auto"/>
+              <w:right w:val="single" w:sz="8" w:space="0" w:color="auto"/>
+            </w:tcBorders>
+          </w:tcPr>
+          <w:p>
+            <w:pPr>
+              <w:jc w:val="center"/>
+              <w:rPr>
+                <w:rFonts w:ascii="Times New Roman" w:eastAsiaTheme="minorEastAsia" w:hAnsi="Times New Roman" w:cs="Times New Roman"/>
+              </w:rPr>
+            </w:pPr>
+            <w:r>
+              <w:rPr>
+                <w:rFonts w:ascii="Times New Roman" w:eastAsiaTheme="minorEastAsia" w:hAnsi="Times New Roman" w:cs="Times New Roman"/>
+              </w:rPr>
+              <w:t>-14.193975</w:t>
+            </w:r>
+          </w:p>
+        </w:tc>
+        <w:tc>
+          <w:tcPr>
+            <w:tcW w:w="0" w:type="auto"/>
+            <w:tcBorders>
+              <w:left w:val="single" w:sz="8" w:space="0" w:color="auto"/>
+              <w:right w:val="single" w:sz="8" w:space="0" w:color="auto"/>
+            </w:tcBorders>
+          </w:tcPr>
+          <w:p>
+            <w:pPr>
+              <w:jc w:val="center"/>
+              <w:rPr>
+                <w:rFonts w:ascii="Times New Roman" w:eastAsiaTheme="minorEastAsia" w:hAnsi="Times New Roman" w:cs="Times New Roman"/>
+              </w:rPr>
+            </w:pPr>
+            <w:r>
+              <w:rPr>
+                <w:rFonts w:ascii="Times New Roman" w:eastAsiaTheme="minorEastAsia" w:hAnsi="Times New Roman" w:cs="Times New Roman"/>
+              </w:rPr>
+              <w:t>-78.748199</w:t>
+            </w:r>
+          </w:p>
+        </w:tc>
+      </w:tr>
+      <w:tr>
+        <w:trPr>
+          <w:jc w:val="center"/>
+        </w:trPr>
+        <w:tc>
+          <w:tcPr>
+            <w:tcW w:w="0" w:type="auto"/>
+            <w:tcBorders>
+              <w:left w:val="single" w:sz="8" w:space="0" w:color="auto"/>
+              <w:right w:val="single" w:sz="8" w:space="0" w:color="auto"/>
+            </w:tcBorders>
+          </w:tcPr>
+          <w:p>
+            <w:pPr>
+              <w:jc w:val="center"/>
+              <w:rPr>
+                <w:rFonts w:ascii="Times New Roman" w:eastAsiaTheme="minorEastAsia" w:hAnsi="Times New Roman" w:cs="Times New Roman"/>
+              </w:rPr>
+            </w:pPr>
+            <w:r>
+              <w:rPr>
+                <w:rFonts w:ascii="Times New Roman" w:eastAsiaTheme="minorEastAsia" w:hAnsi="Times New Roman" w:cs="Times New Roman"/>
+              </w:rPr>
+              <w:t>900</w:t>
+            </w:r>
+          </w:p>
+        </w:tc>
+        <w:tc>
+          <w:tcPr>
+            <w:tcW w:w="0" w:type="auto"/>
+            <w:tcBorders>
+              <w:left w:val="single" w:sz="8" w:space="0" w:color="auto"/>
+              <w:right w:val="single" w:sz="8" w:space="0" w:color="auto"/>
+            </w:tcBorders>
+          </w:tcPr>
+          <w:p>
+            <w:pPr>
+              <w:jc w:val="center"/>
+              <w:rPr>
+                <w:rFonts w:ascii="Times New Roman" w:eastAsiaTheme="minorEastAsia" w:hAnsi="Times New Roman" w:cs="Times New Roman"/>
+              </w:rPr>
+            </w:pPr>
+            <w:r>
+              <w:rPr>
+                <w:rFonts w:ascii="Times New Roman" w:eastAsiaTheme="minorEastAsia" w:hAnsi="Times New Roman" w:cs="Times New Roman"/>
+              </w:rPr>
+              <w:t>-</w:t>
+            </w:r>
+            <w:r>
+              <w:rPr>
+                <w:rFonts w:ascii="Times New Roman" w:eastAsiaTheme="minorEastAsia" w:hAnsi="Times New Roman" w:cs="Times New Roman"/>
+              </w:rPr>
+              <w:t>15.182185</w:t>
+            </w:r>
+          </w:p>
+        </w:tc>
+        <w:tc>
+          <w:tcPr>
+            <w:tcW w:w="0" w:type="auto"/>
+            <w:tcBorders>
+              <w:left w:val="single" w:sz="8" w:space="0" w:color="auto"/>
+              <w:right w:val="single" w:sz="8" w:space="0" w:color="auto"/>
+            </w:tcBorders>
+          </w:tcPr>
+          <w:p>
+            <w:pPr>
+              <w:jc w:val="center"/>
+              <w:rPr>
+                <w:rFonts w:ascii="Times New Roman" w:eastAsiaTheme="minorEastAsia" w:hAnsi="Times New Roman" w:cs="Times New Roman"/>
+              </w:rPr>
+            </w:pPr>
+            <w:r>
+              <w:rPr>
+                <w:rFonts w:ascii="Times New Roman" w:eastAsiaTheme="minorEastAsia" w:hAnsi="Times New Roman" w:cs="Times New Roman"/>
+              </w:rPr>
+              <w:t>-79.971464</w:t>
+            </w:r>
+          </w:p>
+        </w:tc>
+      </w:tr>
+      <w:tr>
+        <w:trPr>
+          <w:jc w:val="center"/>
+        </w:trPr>
+        <w:tc>
+          <w:tcPr>
+            <w:tcW w:w="0" w:type="auto"/>
+            <w:tcBorders>
+              <w:left w:val="single" w:sz="8" w:space="0" w:color="auto"/>
+              <w:bottom w:val="single" w:sz="8" w:space="0" w:color="auto"/>
+              <w:right w:val="single" w:sz="8" w:space="0" w:color="auto"/>
+            </w:tcBorders>
+          </w:tcPr>
+          <w:p>
+            <w:pPr>
+              <w:jc w:val="center"/>
+              <w:rPr>
+                <w:rFonts w:ascii="Times New Roman" w:eastAsiaTheme="minorEastAsia" w:hAnsi="Times New Roman" w:cs="Times New Roman"/>
+              </w:rPr>
+            </w:pPr>
+            <w:r>
+              <w:rPr>
+                <w:rFonts w:ascii="Times New Roman" w:eastAsiaTheme="minorEastAsia" w:hAnsi="Times New Roman" w:cs="Times New Roman"/>
+              </w:rPr>
+              <w:t>1000</w:t>
+            </w:r>
+          </w:p>
+        </w:tc>
+        <w:tc>
+          <w:tcPr>
+            <w:tcW w:w="0" w:type="auto"/>
+            <w:tcBorders>
+              <w:left w:val="single" w:sz="8" w:space="0" w:color="auto"/>
+              <w:bottom w:val="single" w:sz="8" w:space="0" w:color="auto"/>
+              <w:right w:val="single" w:sz="8" w:space="0" w:color="auto"/>
+            </w:tcBorders>
+          </w:tcPr>
+          <w:p>
+            <w:pPr>
+              <w:jc w:val="center"/>
+              <w:rPr>
+                <w:rFonts w:ascii="Times New Roman" w:eastAsiaTheme="minorEastAsia" w:hAnsi="Times New Roman" w:cs="Times New Roman"/>
+              </w:rPr>
+            </w:pPr>
+            <w:r>
+              <w:rPr>
+                <w:rFonts w:ascii="Times New Roman" w:eastAsiaTheme="minorEastAsia" w:hAnsi="Times New Roman" w:cs="Times New Roman"/>
+              </w:rPr>
+              <w:t>-16.072235</w:t>
+            </w:r>
+          </w:p>
+        </w:tc>
+        <w:tc>
+          <w:tcPr>
+            <w:tcW w:w="0" w:type="auto"/>
+            <w:tcBorders>
+              <w:left w:val="single" w:sz="8" w:space="0" w:color="auto"/>
+              <w:bottom w:val="single" w:sz="8" w:space="0" w:color="auto"/>
+              <w:right w:val="single" w:sz="8" w:space="0" w:color="auto"/>
+            </w:tcBorders>
+          </w:tcPr>
+          <w:p>
+            <w:pPr>
+              <w:jc w:val="center"/>
+              <w:rPr>
+                <w:rFonts w:ascii="Times New Roman" w:eastAsiaTheme="minorEastAsia" w:hAnsi="Times New Roman" w:cs="Times New Roman"/>
+              </w:rPr>
+            </w:pPr>
+            <w:r>
+              <w:rPr>
+                <w:rFonts w:ascii="Times New Roman" w:eastAsiaTheme="minorEastAsia" w:hAnsi="Times New Roman" w:cs="Times New Roman"/>
+              </w:rPr>
+              <w:t>-80.956939</w:t>
+            </w:r>
+          </w:p>
+        </w:tc>
+      </w:tr>
+    </w:tbl>
+    <w:p>
+      <w:pPr>
+        <w:spacing w:after="0" w:line="480" w:lineRule="auto"/>
+        <w:jc w:val="center"/>
+        <w:rPr>
+          <w:rFonts w:ascii="Times New Roman" w:hAnsi="Times New Roman" w:cs="Times New Roman"/>
+          <w:b/>
+          <w:bCs/>
+        </w:rPr>
+      </w:pPr>
+      <w:r>
+        <w:rPr>
+          <w:rFonts w:ascii="Times New Roman" w:hAnsi="Times New Roman" w:cs="Times New Roman"/>
+          <w:b/>
+          <w:bCs/>
+        </w:rPr>
+        <w:t>Table #</w:t>
+      </w:r>
+      <w:r>
+        <w:rPr>
+          <w:rFonts w:ascii="Times New Roman" w:hAnsi="Times New Roman" w:cs="Times New Roman"/>
+          <w:b/>
+          <w:bCs/>
+        </w:rPr>
+        <w:t>3</w:t>
+      </w:r>
+      <w:r>
+        <w:rPr>
+          <w:rFonts w:ascii="Times New Roman" w:hAnsi="Times New Roman" w:cs="Times New Roman"/>
+          <w:b/>
+          <w:bCs/>
+        </w:rPr>
+        <w:t>:</w:t>
+      </w:r>
+      <w:r>
+        <w:rPr>
+          <w:rFonts w:ascii="Times New Roman" w:hAnsi="Times New Roman" w:cs="Times New Roman"/>
+          <w:b/>
+          <w:bCs/>
+        </w:rPr>
+        <w:t xml:space="preserve"> Low</w:t>
+      </w:r>
+      <w:r>
+        <w:rPr>
+          <w:rFonts w:ascii="Times New Roman" w:hAnsi="Times New Roman" w:cs="Times New Roman"/>
+          <w:b/>
+          <w:bCs/>
+        </w:rPr>
+        <w:t xml:space="preserve"> Pass Filter</w:t>
+      </w:r>
+      <w:r>
+        <w:rPr>
+          <w:rFonts w:ascii="Times New Roman" w:hAnsi="Times New Roman" w:cs="Times New Roman"/>
+          <w:b/>
+          <w:bCs/>
+        </w:rPr>
+        <w:t xml:space="preserve"> Simulation</w:t>
+      </w:r>
+      <w:r>
+        <w:rPr>
+          <w:rFonts w:ascii="Times New Roman" w:hAnsi="Times New Roman" w:cs="Times New Roman"/>
+          <w:b/>
+          <w:bCs/>
+        </w:rPr>
+        <w:t xml:space="preserve"> Results</w:t>
+      </w:r>
+    </w:p>
+    <w:tbl>
+      <w:tblPr>
+        <w:tblStyle w:val="TableGrid"/>
+        <w:tblW w:w="0" w:type="auto"/>
+        <w:jc w:val="center"/>
+        <w:tblLook w:val="04A0" w:firstRow="1" w:lastRow="0" w:firstColumn="1" w:lastColumn="0" w:noHBand="0" w:noVBand="1"/>
+      </w:tblPr>
+      <w:tblGrid>
+        <w:gridCol w:w="809"/>
+        <w:gridCol w:w="1436"/>
+        <w:gridCol w:w="2545"/>
+      </w:tblGrid>
+      <w:tr>
+        <w:trPr>
+          <w:jc w:val="center"/>
+        </w:trPr>
+        <w:tc>
+          <w:tcPr>
+            <w:tcW w:w="0" w:type="auto"/>
+            <w:tcBorders>
+              <w:top w:val="nil"/>
+              <w:left w:val="nil"/>
+              <w:bottom w:val="single" w:sz="8" w:space="0" w:color="auto"/>
+              <w:right w:val="single" w:sz="8" w:space="0" w:color="auto"/>
+            </w:tcBorders>
+          </w:tcPr>
+          <w:p>
+            <w:pPr>
+              <w:jc w:val="center"/>
+              <w:rPr>
+                <w:rFonts w:ascii="Times New Roman" w:eastAsiaTheme="minorEastAsia" w:hAnsi="Times New Roman" w:cs="Times New Roman"/>
+                <w:b/>
+                <w:bCs/>
+              </w:rPr>
+            </w:pPr>
+          </w:p>
+        </w:tc>
+        <w:tc>
+          <w:tcPr>
+            <w:tcW w:w="0" w:type="auto"/>
+            <w:gridSpan w:val="2"/>
+            <w:tcBorders>
+              <w:top w:val="single" w:sz="8" w:space="0" w:color="auto"/>
+              <w:left w:val="single" w:sz="8" w:space="0" w:color="auto"/>
+              <w:bottom w:val="single" w:sz="8" w:space="0" w:color="auto"/>
+              <w:right w:val="single" w:sz="8" w:space="0" w:color="auto"/>
+            </w:tcBorders>
+          </w:tcPr>
+          <w:p>
+            <w:pPr>
+              <w:jc w:val="center"/>
+              <w:rPr>
+                <w:rFonts w:ascii="Times New Roman" w:eastAsiaTheme="minorEastAsia" w:hAnsi="Times New Roman" w:cs="Times New Roman"/>
+                <w:b/>
+                <w:bCs/>
+              </w:rPr>
+            </w:pPr>
+            <w:r>
+              <w:rPr>
+                <w:rFonts w:ascii="Times New Roman" w:eastAsiaTheme="minorEastAsia" w:hAnsi="Times New Roman" w:cs="Times New Roman"/>
+                <w:b/>
+                <w:bCs/>
+              </w:rPr>
+              <w:t>Simulation</w:t>
+            </w:r>
+          </w:p>
+        </w:tc>
+      </w:tr>
+      <w:tr>
+        <w:trPr>
+          <w:jc w:val="center"/>
+        </w:trPr>
+        <w:tc>
+          <w:tcPr>
+            <w:tcW w:w="0" w:type="auto"/>
+            <w:tcBorders>
+              <w:top w:val="single" w:sz="8" w:space="0" w:color="auto"/>
+              <w:left w:val="single" w:sz="8" w:space="0" w:color="auto"/>
+              <w:bottom w:val="single" w:sz="8" w:space="0" w:color="auto"/>
+              <w:right w:val="single" w:sz="8" w:space="0" w:color="auto"/>
+            </w:tcBorders>
+          </w:tcPr>
+          <w:p>
+            <w:pPr>
+              <w:jc w:val="center"/>
+              <w:rPr>
+                <w:rFonts w:ascii="Times New Roman" w:eastAsiaTheme="minorEastAsia" w:hAnsi="Times New Roman" w:cs="Times New Roman"/>
+                <w:b/>
+                <w:bCs/>
+              </w:rPr>
+            </w:pPr>
+            <w:r>
+              <w:rPr>
+                <w:rFonts w:ascii="Times New Roman" w:eastAsiaTheme="minorEastAsia" w:hAnsi="Times New Roman" w:cs="Times New Roman"/>
+                <w:b/>
+                <w:bCs/>
+              </w:rPr>
+              <w:t>f (Hz)</w:t>
+            </w:r>
+          </w:p>
+        </w:tc>
+        <w:tc>
+          <w:tcPr>
+            <w:tcW w:w="0" w:type="auto"/>
+            <w:tcBorders>
+              <w:top w:val="single" w:sz="8" w:space="0" w:color="auto"/>
+              <w:left w:val="single" w:sz="8" w:space="0" w:color="auto"/>
+              <w:bottom w:val="single" w:sz="8" w:space="0" w:color="auto"/>
+              <w:right w:val="single" w:sz="8" w:space="0" w:color="auto"/>
+            </w:tcBorders>
+          </w:tcPr>
+          <w:p>
+            <w:pPr>
+              <w:jc w:val="center"/>
+              <w:rPr>
+                <w:rFonts w:ascii="Times New Roman" w:eastAsiaTheme="minorEastAsia" w:hAnsi="Times New Roman" w:cs="Times New Roman"/>
+                <w:b/>
+                <w:bCs/>
+              </w:rPr>
+            </w:pPr>
+            <w:r>
+              <w:rPr>
+                <w:rFonts w:ascii="Times New Roman" w:eastAsiaTheme="minorEastAsia" w:hAnsi="Times New Roman" w:cs="Times New Roman"/>
+                <w:b/>
+                <w:bCs/>
+              </w:rPr>
+              <w:t>Gain (dB)</w:t>
+            </w:r>
+          </w:p>
+        </w:tc>
+        <w:tc>
+          <w:tcPr>
+            <w:tcW w:w="0" w:type="auto"/>
+            <w:tcBorders>
+              <w:top w:val="single" w:sz="8" w:space="0" w:color="auto"/>
+              <w:left w:val="single" w:sz="8" w:space="0" w:color="auto"/>
+              <w:bottom w:val="single" w:sz="8" w:space="0" w:color="auto"/>
+              <w:right w:val="single" w:sz="8" w:space="0" w:color="auto"/>
+            </w:tcBorders>
+          </w:tcPr>
+          <w:p>
+            <w:pPr>
+              <w:jc w:val="center"/>
+              <w:rPr>
+                <w:rFonts w:ascii="Times New Roman" w:eastAsiaTheme="minorEastAsia" w:hAnsi="Times New Roman" w:cs="Times New Roman"/>
+                <w:b/>
+                <w:bCs/>
+              </w:rPr>
+            </w:pPr>
+            <w:r>
+              <w:rPr>
+                <w:rFonts w:ascii="Times New Roman" w:eastAsiaTheme="minorEastAsia" w:hAnsi="Times New Roman" w:cs="Times New Roman"/>
+                <w:b/>
+                <w:bCs/>
+              </w:rPr>
+              <w:t>Phase Angles (degrees)</w:t>
+            </w:r>
+          </w:p>
+        </w:tc>
+      </w:tr>
+      <w:tr>
+        <w:trPr>
+          <w:jc w:val="center"/>
+        </w:trPr>
+        <w:tc>
+          <w:tcPr>
+            <w:tcW w:w="0" w:type="auto"/>
+            <w:tcBorders>
+              <w:top w:val="single" w:sz="8" w:space="0" w:color="auto"/>
+              <w:left w:val="single" w:sz="8" w:space="0" w:color="auto"/>
+              <w:right w:val="single" w:sz="8" w:space="0" w:color="auto"/>
+            </w:tcBorders>
+          </w:tcPr>
+          <w:p>
+            <w:pPr>
+              <w:jc w:val="center"/>
+              <w:rPr>
+                <w:rFonts w:ascii="Times New Roman" w:eastAsiaTheme="minorEastAsia" w:hAnsi="Times New Roman" w:cs="Times New Roman"/>
+              </w:rPr>
+            </w:pPr>
+            <w:r>
+              <w:rPr>
+                <w:rFonts w:ascii="Times New Roman" w:eastAsiaTheme="minorEastAsia" w:hAnsi="Times New Roman" w:cs="Times New Roman"/>
+              </w:rPr>
+              <w:t>25</w:t>
+            </w:r>
+          </w:p>
+        </w:tc>
+        <w:tc>
+          <w:tcPr>
+            <w:tcW w:w="0" w:type="auto"/>
+            <w:tcBorders>
+              <w:top w:val="single" w:sz="8" w:space="0" w:color="auto"/>
+              <w:left w:val="single" w:sz="8" w:space="0" w:color="auto"/>
+              <w:right w:val="single" w:sz="8" w:space="0" w:color="auto"/>
+            </w:tcBorders>
+          </w:tcPr>
+          <w:p>
+            <w:pPr>
+              <w:jc w:val="center"/>
+              <w:rPr>
+                <w:rFonts w:ascii="Times New Roman" w:eastAsiaTheme="minorEastAsia" w:hAnsi="Times New Roman" w:cs="Times New Roman"/>
+              </w:rPr>
+            </w:pPr>
+            <w:r>
+              <w:rPr>
+                <w:rFonts w:ascii="Times New Roman" w:eastAsiaTheme="minorEastAsia" w:hAnsi="Times New Roman" w:cs="Times New Roman"/>
+              </w:rPr>
+              <w:t>-16.183464</w:t>
+            </w:r>
+          </w:p>
+        </w:tc>
+        <w:tc>
+          <w:tcPr>
+            <w:tcW w:w="0" w:type="auto"/>
+            <w:tcBorders>
+              <w:top w:val="single" w:sz="8" w:space="0" w:color="auto"/>
+              <w:left w:val="single" w:sz="8" w:space="0" w:color="auto"/>
+              <w:right w:val="single" w:sz="8" w:space="0" w:color="auto"/>
+            </w:tcBorders>
+          </w:tcPr>
+          <w:p>
+            <w:pPr>
+              <w:tabs>
+                <w:tab w:val="left" w:pos="708"/>
+              </w:tabs>
+              <w:rPr>
+                <w:rFonts w:ascii="Times New Roman" w:eastAsiaTheme="minorEastAsia" w:hAnsi="Times New Roman" w:cs="Times New Roman"/>
+              </w:rPr>
+            </w:pPr>
+            <w:r>
+              <w:rPr>
+                <w:rFonts w:ascii="Times New Roman" w:eastAsiaTheme="minorEastAsia" w:hAnsi="Times New Roman" w:cs="Times New Roman"/>
+              </w:rPr>
+              <w:tab/>
+            </w:r>
+            <w:r>
+              <w:rPr>
+                <w:rFonts w:ascii="Times New Roman" w:eastAsiaTheme="minorEastAsia" w:hAnsi="Times New Roman" w:cs="Times New Roman"/>
+              </w:rPr>
+              <w:t>81.072857</w:t>
+            </w:r>
+          </w:p>
+        </w:tc>
+      </w:tr>
+      <w:tr>
+        <w:trPr>
+          <w:jc w:val="center"/>
+        </w:trPr>
+        <w:tc>
+          <w:tcPr>
+            <w:tcW w:w="0" w:type="auto"/>
+            <w:tcBorders>
+              <w:left w:val="single" w:sz="8" w:space="0" w:color="auto"/>
+              <w:right w:val="single" w:sz="8" w:space="0" w:color="auto"/>
+            </w:tcBorders>
+          </w:tcPr>
+          <w:p>
+            <w:pPr>
+              <w:jc w:val="center"/>
+              <w:rPr>
+                <w:rFonts w:ascii="Times New Roman" w:eastAsiaTheme="minorEastAsia" w:hAnsi="Times New Roman" w:cs="Times New Roman"/>
+              </w:rPr>
+            </w:pPr>
+            <w:r>
+              <w:rPr>
+                <w:rFonts w:ascii="Times New Roman" w:eastAsiaTheme="minorEastAsia" w:hAnsi="Times New Roman" w:cs="Times New Roman"/>
+              </w:rPr>
+              <w:t>50</w:t>
+            </w:r>
+          </w:p>
+        </w:tc>
+        <w:tc>
+          <w:tcPr>
+            <w:tcW w:w="0" w:type="auto"/>
+            <w:tcBorders>
+              <w:left w:val="single" w:sz="8" w:space="0" w:color="auto"/>
+              <w:right w:val="single" w:sz="8" w:space="0" w:color="auto"/>
+            </w:tcBorders>
+          </w:tcPr>
+          <w:p>
+            <w:pPr>
+              <w:jc w:val="center"/>
+              <w:rPr>
+                <w:rFonts w:ascii="Times New Roman" w:eastAsiaTheme="minorEastAsia" w:hAnsi="Times New Roman" w:cs="Times New Roman"/>
+              </w:rPr>
+            </w:pPr>
+            <w:r>
+              <w:rPr>
+                <w:rFonts w:ascii="Times New Roman" w:eastAsiaTheme="minorEastAsia" w:hAnsi="Times New Roman" w:cs="Times New Roman"/>
+              </w:rPr>
+              <w:t>-10.46579</w:t>
+            </w:r>
+          </w:p>
+        </w:tc>
+        <w:tc>
+          <w:tcPr>
+            <w:tcW w:w="0" w:type="auto"/>
+            <w:tcBorders>
+              <w:left w:val="single" w:sz="8" w:space="0" w:color="auto"/>
+              <w:right w:val="single" w:sz="8" w:space="0" w:color="auto"/>
+            </w:tcBorders>
+          </w:tcPr>
+          <w:p>
+            <w:pPr>
+              <w:jc w:val="center"/>
+              <w:rPr>
+                <w:rFonts w:ascii="Times New Roman" w:eastAsiaTheme="minorEastAsia" w:hAnsi="Times New Roman" w:cs="Times New Roman"/>
+              </w:rPr>
+            </w:pPr>
+            <w:r>
+              <w:rPr>
+                <w:rFonts w:ascii="Times New Roman" w:eastAsiaTheme="minorEastAsia" w:hAnsi="Times New Roman" w:cs="Times New Roman"/>
+              </w:rPr>
+              <w:t>72.559297</w:t>
+            </w:r>
+          </w:p>
+        </w:tc>
+      </w:tr>
+      <w:tr>
+        <w:trPr>
+          <w:jc w:val="center"/>
+        </w:trPr>
+        <w:tc>
+          <w:tcPr>
+            <w:tcW w:w="0" w:type="auto"/>
+            <w:tcBorders>
+              <w:left w:val="single" w:sz="8" w:space="0" w:color="auto"/>
+              <w:right w:val="single" w:sz="8" w:space="0" w:color="auto"/>
+            </w:tcBorders>
+          </w:tcPr>
+          <w:p>
+            <w:pPr>
+              <w:jc w:val="center"/>
+              <w:rPr>
+                <w:rFonts w:ascii="Times New Roman" w:eastAsiaTheme="minorEastAsia" w:hAnsi="Times New Roman" w:cs="Times New Roman"/>
+              </w:rPr>
+            </w:pPr>
+            <w:r>
+              <w:rPr>
+                <w:rFonts w:ascii="Times New Roman" w:eastAsiaTheme="minorEastAsia" w:hAnsi="Times New Roman" w:cs="Times New Roman"/>
+              </w:rPr>
+              <w:t>75</w:t>
+            </w:r>
+          </w:p>
+        </w:tc>
+        <w:tc>
+          <w:tcPr>
+            <w:tcW w:w="0" w:type="auto"/>
+            <w:tcBorders>
+              <w:left w:val="single" w:sz="8" w:space="0" w:color="auto"/>
+              <w:right w:val="single" w:sz="8" w:space="0" w:color="auto"/>
+            </w:tcBorders>
+          </w:tcPr>
+          <w:p>
+            <w:pPr>
+              <w:jc w:val="center"/>
+              <w:rPr>
+                <w:rFonts w:ascii="Times New Roman" w:eastAsiaTheme="minorEastAsia" w:hAnsi="Times New Roman" w:cs="Times New Roman"/>
+              </w:rPr>
+            </w:pPr>
+            <w:r>
+              <w:rPr>
+                <w:rFonts w:ascii="Times New Roman" w:eastAsiaTheme="minorEastAsia" w:hAnsi="Times New Roman" w:cs="Times New Roman"/>
+              </w:rPr>
+              <w:t>-7.406144</w:t>
+            </w:r>
+          </w:p>
+        </w:tc>
+        <w:tc>
+          <w:tcPr>
+            <w:tcW w:w="0" w:type="auto"/>
+            <w:tcBorders>
+              <w:left w:val="single" w:sz="8" w:space="0" w:color="auto"/>
+              <w:right w:val="single" w:sz="8" w:space="0" w:color="auto"/>
+            </w:tcBorders>
+          </w:tcPr>
+          <w:p>
+            <w:pPr>
+              <w:jc w:val="center"/>
+              <w:rPr>
+                <w:rFonts w:ascii="Times New Roman" w:eastAsiaTheme="minorEastAsia" w:hAnsi="Times New Roman" w:cs="Times New Roman"/>
+              </w:rPr>
+            </w:pPr>
+            <w:r>
+              <w:rPr>
+                <w:rFonts w:ascii="Times New Roman" w:eastAsiaTheme="minorEastAsia" w:hAnsi="Times New Roman" w:cs="Times New Roman"/>
+              </w:rPr>
+              <w:t>64.768256</w:t>
+            </w:r>
+          </w:p>
+        </w:tc>
+      </w:tr>
+      <w:tr>
+        <w:trPr>
+          <w:jc w:val="center"/>
+        </w:trPr>
+        <w:tc>
+          <w:tcPr>
+            <w:tcW w:w="0" w:type="auto"/>
+            <w:tcBorders>
+              <w:left w:val="single" w:sz="8" w:space="0" w:color="auto"/>
+              <w:right w:val="single" w:sz="8" w:space="0" w:color="auto"/>
+            </w:tcBorders>
+          </w:tcPr>
+          <w:p>
+            <w:pPr>
+              <w:jc w:val="center"/>
+              <w:rPr>
+                <w:rFonts w:ascii="Times New Roman" w:eastAsiaTheme="minorEastAsia" w:hAnsi="Times New Roman" w:cs="Times New Roman"/>
+              </w:rPr>
+            </w:pPr>
+            <w:r>
+              <w:rPr>
+                <w:rFonts w:ascii="Times New Roman" w:eastAsiaTheme="minorEastAsia" w:hAnsi="Times New Roman" w:cs="Times New Roman"/>
+              </w:rPr>
+              <w:t>100</w:t>
+            </w:r>
+          </w:p>
+        </w:tc>
+        <w:tc>
+          <w:tcPr>
+            <w:tcW w:w="0" w:type="auto"/>
+            <w:tcBorders>
+              <w:left w:val="single" w:sz="8" w:space="0" w:color="auto"/>
+              <w:right w:val="single" w:sz="8" w:space="0" w:color="auto"/>
+            </w:tcBorders>
+          </w:tcPr>
+          <w:p>
+            <w:pPr>
+              <w:jc w:val="center"/>
+              <w:rPr>
+                <w:rFonts w:ascii="Times New Roman" w:eastAsiaTheme="minorEastAsia" w:hAnsi="Times New Roman" w:cs="Times New Roman"/>
+              </w:rPr>
+            </w:pPr>
+            <w:r>
+              <w:rPr>
+                <w:rFonts w:ascii="Times New Roman" w:eastAsiaTheme="minorEastAsia" w:hAnsi="Times New Roman" w:cs="Times New Roman"/>
+              </w:rPr>
+              <w:t>-5.4814727</w:t>
+            </w:r>
+          </w:p>
+        </w:tc>
+        <w:tc>
+          <w:tcPr>
+            <w:tcW w:w="0" w:type="auto"/>
+            <w:tcBorders>
+              <w:left w:val="single" w:sz="8" w:space="0" w:color="auto"/>
+              <w:right w:val="single" w:sz="8" w:space="0" w:color="auto"/>
+            </w:tcBorders>
+          </w:tcPr>
+          <w:p>
+            <w:pPr>
+              <w:jc w:val="center"/>
+              <w:rPr>
+                <w:rFonts w:ascii="Times New Roman" w:eastAsiaTheme="minorEastAsia" w:hAnsi="Times New Roman" w:cs="Times New Roman"/>
+              </w:rPr>
+            </w:pPr>
+            <w:r>
+              <w:rPr>
+                <w:rFonts w:ascii="Times New Roman" w:eastAsiaTheme="minorEastAsia" w:hAnsi="Times New Roman" w:cs="Times New Roman"/>
+              </w:rPr>
+              <w:t>57.858092</w:t>
+            </w:r>
+          </w:p>
+        </w:tc>
+      </w:tr>
+      <w:tr>
+        <w:trPr>
+          <w:jc w:val="center"/>
+        </w:trPr>
+        <w:tc>
+          <w:tcPr>
+            <w:tcW w:w="0" w:type="auto"/>
+            <w:tcBorders>
+              <w:left w:val="single" w:sz="8" w:space="0" w:color="auto"/>
+              <w:right w:val="single" w:sz="8" w:space="0" w:color="auto"/>
+            </w:tcBorders>
+          </w:tcPr>
+          <w:p>
+            <w:pPr>
+              <w:jc w:val="center"/>
+              <w:rPr>
+                <w:rFonts w:ascii="Times New Roman" w:eastAsiaTheme="minorEastAsia" w:hAnsi="Times New Roman" w:cs="Times New Roman"/>
+              </w:rPr>
+            </w:pPr>
+            <w:r>
+              <w:rPr>
+                <w:rFonts w:ascii="Times New Roman" w:eastAsiaTheme="minorEastAsia" w:hAnsi="Times New Roman" w:cs="Times New Roman"/>
+              </w:rPr>
+              <w:t>150</w:t>
+            </w:r>
+          </w:p>
+        </w:tc>
+        <w:tc>
+          <w:tcPr>
+            <w:tcW w:w="0" w:type="auto"/>
+            <w:tcBorders>
+              <w:left w:val="single" w:sz="8" w:space="0" w:color="auto"/>
+              <w:right w:val="single" w:sz="8" w:space="0" w:color="auto"/>
+            </w:tcBorders>
+          </w:tcPr>
+          <w:p>
+            <w:pPr>
+              <w:jc w:val="center"/>
+              <w:rPr>
+                <w:rFonts w:ascii="Times New Roman" w:eastAsiaTheme="minorEastAsia" w:hAnsi="Times New Roman" w:cs="Times New Roman"/>
+              </w:rPr>
+            </w:pPr>
+            <w:r>
+              <w:rPr>
+                <w:rFonts w:ascii="Times New Roman" w:eastAsiaTheme="minorEastAsia" w:hAnsi="Times New Roman" w:cs="Times New Roman"/>
+              </w:rPr>
+              <w:t>-3.2752096</w:t>
+            </w:r>
+          </w:p>
+        </w:tc>
+        <w:tc>
+          <w:tcPr>
+            <w:tcW w:w="0" w:type="auto"/>
+            <w:tcBorders>
+              <w:left w:val="single" w:sz="8" w:space="0" w:color="auto"/>
+              <w:right w:val="single" w:sz="8" w:space="0" w:color="auto"/>
+            </w:tcBorders>
+          </w:tcPr>
+          <w:p>
+            <w:pPr>
+              <w:jc w:val="center"/>
+              <w:rPr>
+                <w:rFonts w:ascii="Times New Roman" w:eastAsiaTheme="minorEastAsia" w:hAnsi="Times New Roman" w:cs="Times New Roman"/>
+              </w:rPr>
+            </w:pPr>
+            <w:r>
+              <w:rPr>
+                <w:rFonts w:ascii="Times New Roman" w:eastAsiaTheme="minorEastAsia" w:hAnsi="Times New Roman" w:cs="Times New Roman"/>
+              </w:rPr>
+              <w:t>46.696191</w:t>
+            </w:r>
+          </w:p>
+        </w:tc>
+      </w:tr>
+      <w:tr>
+        <w:trPr>
+          <w:jc w:val="center"/>
+        </w:trPr>
+        <w:tc>
+          <w:tcPr>
+            <w:tcW w:w="0" w:type="auto"/>
+            <w:tcBorders>
+              <w:left w:val="single" w:sz="8" w:space="0" w:color="auto"/>
+              <w:right w:val="single" w:sz="8" w:space="0" w:color="auto"/>
+            </w:tcBorders>
+          </w:tcPr>
+          <w:p>
+            <w:pPr>
+              <w:jc w:val="center"/>
+              <w:rPr>
+                <w:rFonts w:ascii="Times New Roman" w:eastAsiaTheme="minorEastAsia" w:hAnsi="Times New Roman" w:cs="Times New Roman"/>
+              </w:rPr>
+            </w:pPr>
+            <w:r>
+              <w:rPr>
+                <w:rFonts w:ascii="Times New Roman" w:eastAsiaTheme="minorEastAsia" w:hAnsi="Times New Roman" w:cs="Times New Roman"/>
+              </w:rPr>
+              <w:t>200</w:t>
+            </w:r>
+          </w:p>
+        </w:tc>
+        <w:tc>
+          <w:tcPr>
+            <w:tcW w:w="0" w:type="auto"/>
+            <w:tcBorders>
+              <w:left w:val="single" w:sz="8" w:space="0" w:color="auto"/>
+              <w:right w:val="single" w:sz="8" w:space="0" w:color="auto"/>
+            </w:tcBorders>
+          </w:tcPr>
+          <w:p>
+            <w:pPr>
+              <w:jc w:val="center"/>
+              <w:rPr>
+                <w:rFonts w:ascii="Times New Roman" w:eastAsiaTheme="minorEastAsia" w:hAnsi="Times New Roman" w:cs="Times New Roman"/>
+              </w:rPr>
+            </w:pPr>
+            <w:r>
+              <w:rPr>
+                <w:rFonts w:ascii="Times New Roman" w:eastAsiaTheme="minorEastAsia" w:hAnsi="Times New Roman" w:cs="Times New Roman"/>
+              </w:rPr>
+              <w:t>-</w:t>
+            </w:r>
+            <w:r>
+              <w:rPr>
+                <w:rFonts w:ascii="Times New Roman" w:eastAsiaTheme="minorEastAsia" w:hAnsi="Times New Roman" w:cs="Times New Roman"/>
+              </w:rPr>
+              <w:t>2.1305798</w:t>
+            </w:r>
+          </w:p>
+        </w:tc>
+        <w:tc>
+          <w:tcPr>
+            <w:tcW w:w="0" w:type="auto"/>
+            <w:tcBorders>
+              <w:left w:val="single" w:sz="8" w:space="0" w:color="auto"/>
+              <w:right w:val="single" w:sz="8" w:space="0" w:color="auto"/>
+            </w:tcBorders>
+          </w:tcPr>
+          <w:p>
+            <w:pPr>
+              <w:jc w:val="center"/>
+              <w:rPr>
+                <w:rFonts w:ascii="Times New Roman" w:eastAsiaTheme="minorEastAsia" w:hAnsi="Times New Roman" w:cs="Times New Roman"/>
+              </w:rPr>
+            </w:pPr>
+            <w:r>
+              <w:rPr>
+                <w:rFonts w:ascii="Times New Roman" w:eastAsiaTheme="minorEastAsia" w:hAnsi="Times New Roman" w:cs="Times New Roman"/>
+              </w:rPr>
+              <w:t>38.511938</w:t>
+            </w:r>
+          </w:p>
+        </w:tc>
+      </w:tr>
+      <w:tr>
+        <w:trPr>
+          <w:jc w:val="center"/>
+        </w:trPr>
+        <w:tc>
+          <w:tcPr>
+            <w:tcW w:w="0" w:type="auto"/>
+            <w:tcBorders>
+              <w:left w:val="single" w:sz="8" w:space="0" w:color="auto"/>
+              <w:right w:val="single" w:sz="8" w:space="0" w:color="auto"/>
+            </w:tcBorders>
+          </w:tcPr>
+          <w:p>
+            <w:pPr>
+              <w:jc w:val="center"/>
+              <w:rPr>
+                <w:rFonts w:ascii="Times New Roman" w:eastAsiaTheme="minorEastAsia" w:hAnsi="Times New Roman" w:cs="Times New Roman"/>
+              </w:rPr>
+            </w:pPr>
+            <w:r>
+              <w:rPr>
+                <w:rFonts w:ascii="Times New Roman" w:eastAsiaTheme="minorEastAsia" w:hAnsi="Times New Roman" w:cs="Times New Roman"/>
+              </w:rPr>
+              <w:t>300</w:t>
+            </w:r>
+          </w:p>
+        </w:tc>
+        <w:tc>
+          <w:tcPr>
+            <w:tcW w:w="0" w:type="auto"/>
+            <w:tcBorders>
+              <w:left w:val="single" w:sz="8" w:space="0" w:color="auto"/>
+              <w:right w:val="single" w:sz="8" w:space="0" w:color="auto"/>
+            </w:tcBorders>
+          </w:tcPr>
+          <w:p>
+            <w:pPr>
+              <w:jc w:val="center"/>
+              <w:rPr>
+                <w:rFonts w:ascii="Times New Roman" w:eastAsiaTheme="minorEastAsia" w:hAnsi="Times New Roman" w:cs="Times New Roman"/>
+              </w:rPr>
+            </w:pPr>
+            <w:r>
+              <w:rPr>
+                <w:rFonts w:ascii="Times New Roman" w:eastAsiaTheme="minorEastAsia" w:hAnsi="Times New Roman" w:cs="Times New Roman"/>
+              </w:rPr>
+              <w:t>-1.0770344</w:t>
+            </w:r>
+          </w:p>
+        </w:tc>
+        <w:tc>
+          <w:tcPr>
+            <w:tcW w:w="0" w:type="auto"/>
+            <w:tcBorders>
+              <w:left w:val="single" w:sz="8" w:space="0" w:color="auto"/>
+              <w:right w:val="single" w:sz="8" w:space="0" w:color="auto"/>
+            </w:tcBorders>
+          </w:tcPr>
+          <w:p>
+            <w:pPr>
+              <w:jc w:val="center"/>
+              <w:rPr>
+                <w:rFonts w:ascii="Times New Roman" w:eastAsiaTheme="minorEastAsia" w:hAnsi="Times New Roman" w:cs="Times New Roman"/>
+              </w:rPr>
+            </w:pPr>
+            <w:r>
+              <w:rPr>
+                <w:rFonts w:ascii="Times New Roman" w:eastAsiaTheme="minorEastAsia" w:hAnsi="Times New Roman" w:cs="Times New Roman"/>
+              </w:rPr>
+              <w:t>27.946801</w:t>
+            </w:r>
+          </w:p>
+        </w:tc>
+      </w:tr>
+      <w:tr>
+        <w:trPr>
+          <w:jc w:val="center"/>
+        </w:trPr>
+        <w:tc>
+          <w:tcPr>
+            <w:tcW w:w="0" w:type="auto"/>
+            <w:tcBorders>
+              <w:left w:val="single" w:sz="8" w:space="0" w:color="auto"/>
+              <w:right w:val="single" w:sz="8" w:space="0" w:color="auto"/>
+            </w:tcBorders>
+          </w:tcPr>
+          <w:p>
+            <w:pPr>
+              <w:jc w:val="center"/>
+              <w:rPr>
+                <w:rFonts w:ascii="Times New Roman" w:eastAsiaTheme="minorEastAsia" w:hAnsi="Times New Roman" w:cs="Times New Roman"/>
+              </w:rPr>
+            </w:pPr>
+            <w:r>
+              <w:rPr>
+                <w:rFonts w:ascii="Times New Roman" w:eastAsiaTheme="minorEastAsia" w:hAnsi="Times New Roman" w:cs="Times New Roman"/>
+              </w:rPr>
+              <w:t>500</w:t>
+            </w:r>
+          </w:p>
+        </w:tc>
+        <w:tc>
+          <w:tcPr>
+            <w:tcW w:w="0" w:type="auto"/>
+            <w:tcBorders>
+              <w:left w:val="single" w:sz="8" w:space="0" w:color="auto"/>
+              <w:right w:val="single" w:sz="8" w:space="0" w:color="auto"/>
+            </w:tcBorders>
+          </w:tcPr>
+          <w:p>
+            <w:pPr>
+              <w:jc w:val="center"/>
+              <w:rPr>
+                <w:rFonts w:ascii="Times New Roman" w:eastAsiaTheme="minorEastAsia" w:hAnsi="Times New Roman" w:cs="Times New Roman"/>
+              </w:rPr>
+            </w:pPr>
+            <w:r>
+              <w:rPr>
+                <w:rFonts w:ascii="Times New Roman" w:eastAsiaTheme="minorEastAsia" w:hAnsi="Times New Roman" w:cs="Times New Roman"/>
+              </w:rPr>
+              <w:t>-0.41915173</w:t>
+            </w:r>
+          </w:p>
+        </w:tc>
+        <w:tc>
+          <w:tcPr>
+            <w:tcW w:w="0" w:type="auto"/>
+            <w:tcBorders>
+              <w:left w:val="single" w:sz="8" w:space="0" w:color="auto"/>
+              <w:right w:val="single" w:sz="8" w:space="0" w:color="auto"/>
+            </w:tcBorders>
+          </w:tcPr>
+          <w:p>
+            <w:pPr>
+              <w:jc w:val="center"/>
+              <w:rPr>
+                <w:rFonts w:ascii="Times New Roman" w:eastAsiaTheme="minorEastAsia" w:hAnsi="Times New Roman" w:cs="Times New Roman"/>
+              </w:rPr>
+            </w:pPr>
+            <w:r>
+              <w:rPr>
+                <w:rFonts w:ascii="Times New Roman" w:eastAsiaTheme="minorEastAsia" w:hAnsi="Times New Roman" w:cs="Times New Roman"/>
+              </w:rPr>
+              <w:t>17.656897</w:t>
+            </w:r>
+          </w:p>
+        </w:tc>
+      </w:tr>
+      <w:tr>
+        <w:trPr>
+          <w:jc w:val="center"/>
+        </w:trPr>
+        <w:tc>
+          <w:tcPr>
+            <w:tcW w:w="0" w:type="auto"/>
+            <w:tcBorders>
+              <w:left w:val="single" w:sz="8" w:space="0" w:color="auto"/>
+              <w:right w:val="single" w:sz="8" w:space="0" w:color="auto"/>
+            </w:tcBorders>
+          </w:tcPr>
+          <w:p>
+            <w:pPr>
+              <w:jc w:val="center"/>
+              <w:rPr>
+                <w:rFonts w:ascii="Times New Roman" w:eastAsiaTheme="minorEastAsia" w:hAnsi="Times New Roman" w:cs="Times New Roman"/>
+              </w:rPr>
+            </w:pPr>
+            <w:r>
+              <w:rPr>
+                <w:rFonts w:ascii="Times New Roman" w:eastAsiaTheme="minorEastAsia" w:hAnsi="Times New Roman" w:cs="Times New Roman"/>
+              </w:rPr>
+              <w:t>600</w:t>
+            </w:r>
+          </w:p>
+        </w:tc>
+        <w:tc>
+          <w:tcPr>
+            <w:tcW w:w="0" w:type="auto"/>
+            <w:tcBorders>
+              <w:left w:val="single" w:sz="8" w:space="0" w:color="auto"/>
+              <w:right w:val="single" w:sz="8" w:space="0" w:color="auto"/>
+            </w:tcBorders>
+          </w:tcPr>
+          <w:p>
+            <w:pPr>
+              <w:jc w:val="center"/>
+              <w:rPr>
+                <w:rFonts w:ascii="Times New Roman" w:eastAsiaTheme="minorEastAsia" w:hAnsi="Times New Roman" w:cs="Times New Roman"/>
+              </w:rPr>
+            </w:pPr>
+            <w:r>
+              <w:rPr>
+                <w:rFonts w:ascii="Times New Roman" w:eastAsiaTheme="minorEastAsia" w:hAnsi="Times New Roman" w:cs="Times New Roman"/>
+              </w:rPr>
+              <w:t>-0.29531781</w:t>
+            </w:r>
+          </w:p>
+        </w:tc>
+        <w:tc>
+          <w:tcPr>
+            <w:tcW w:w="0" w:type="auto"/>
+            <w:tcBorders>
+              <w:left w:val="single" w:sz="8" w:space="0" w:color="auto"/>
+              <w:right w:val="single" w:sz="8" w:space="0" w:color="auto"/>
+            </w:tcBorders>
+          </w:tcPr>
+          <w:p>
+            <w:pPr>
+              <w:jc w:val="center"/>
+              <w:rPr>
+                <w:rFonts w:ascii="Times New Roman" w:eastAsiaTheme="minorEastAsia" w:hAnsi="Times New Roman" w:cs="Times New Roman"/>
+              </w:rPr>
+            </w:pPr>
+            <w:r>
+              <w:rPr>
+                <w:rFonts w:ascii="Times New Roman" w:eastAsiaTheme="minorEastAsia" w:hAnsi="Times New Roman" w:cs="Times New Roman"/>
+              </w:rPr>
+              <w:t>14.856181</w:t>
+            </w:r>
+          </w:p>
+        </w:tc>
+      </w:tr>
+      <w:tr>
+        <w:trPr>
+          <w:jc w:val="center"/>
+        </w:trPr>
+        <w:tc>
+          <w:tcPr>
+            <w:tcW w:w="0" w:type="auto"/>
+            <w:tcBorders>
+              <w:left w:val="single" w:sz="8" w:space="0" w:color="auto"/>
+              <w:right w:val="single" w:sz="8" w:space="0" w:color="auto"/>
+            </w:tcBorders>
+          </w:tcPr>
+          <w:p>
+            <w:pPr>
+              <w:jc w:val="center"/>
+              <w:rPr>
+                <w:rFonts w:ascii="Times New Roman" w:eastAsiaTheme="minorEastAsia" w:hAnsi="Times New Roman" w:cs="Times New Roman"/>
+              </w:rPr>
+            </w:pPr>
+            <w:r>
+              <w:rPr>
+                <w:rFonts w:ascii="Times New Roman" w:eastAsiaTheme="minorEastAsia" w:hAnsi="Times New Roman" w:cs="Times New Roman"/>
+              </w:rPr>
+              <w:t>700</w:t>
+            </w:r>
+          </w:p>
+        </w:tc>
+        <w:tc>
+          <w:tcPr>
+            <w:tcW w:w="0" w:type="auto"/>
+            <w:tcBorders>
+              <w:left w:val="single" w:sz="8" w:space="0" w:color="auto"/>
+              <w:right w:val="single" w:sz="8" w:space="0" w:color="auto"/>
+            </w:tcBorders>
+          </w:tcPr>
+          <w:p>
+            <w:pPr>
+              <w:jc w:val="center"/>
+              <w:rPr>
+                <w:rFonts w:ascii="Times New Roman" w:eastAsiaTheme="minorEastAsia" w:hAnsi="Times New Roman" w:cs="Times New Roman"/>
+              </w:rPr>
+            </w:pPr>
+            <w:r>
+              <w:rPr>
+                <w:rFonts w:ascii="Times New Roman" w:eastAsiaTheme="minorEastAsia" w:hAnsi="Times New Roman" w:cs="Times New Roman"/>
+              </w:rPr>
+              <w:t>-</w:t>
+            </w:r>
+            <w:r>
+              <w:rPr>
+                <w:rFonts w:ascii="Times New Roman" w:eastAsiaTheme="minorEastAsia" w:hAnsi="Times New Roman" w:cs="Times New Roman"/>
+              </w:rPr>
+              <w:t>0.21890279</w:t>
+            </w:r>
+          </w:p>
+        </w:tc>
+        <w:tc>
+          <w:tcPr>
+            <w:tcW w:w="0" w:type="auto"/>
+            <w:tcBorders>
+              <w:left w:val="single" w:sz="8" w:space="0" w:color="auto"/>
+              <w:right w:val="single" w:sz="8" w:space="0" w:color="auto"/>
+            </w:tcBorders>
+          </w:tcPr>
+          <w:p>
+            <w:pPr>
+              <w:jc w:val="center"/>
+              <w:rPr>
+                <w:rFonts w:ascii="Times New Roman" w:eastAsiaTheme="minorEastAsia" w:hAnsi="Times New Roman" w:cs="Times New Roman"/>
+              </w:rPr>
+            </w:pPr>
+            <w:r>
+              <w:rPr>
+                <w:rFonts w:ascii="Times New Roman" w:eastAsiaTheme="minorEastAsia" w:hAnsi="Times New Roman" w:cs="Times New Roman"/>
+              </w:rPr>
+              <w:t>12.809344</w:t>
+            </w:r>
+          </w:p>
+        </w:tc>
+      </w:tr>
+      <w:tr>
+        <w:trPr>
+          <w:jc w:val="center"/>
+        </w:trPr>
+        <w:tc>
+          <w:tcPr>
+            <w:tcW w:w="0" w:type="auto"/>
+            <w:tcBorders>
+              <w:left w:val="single" w:sz="8" w:space="0" w:color="auto"/>
+              <w:right w:val="single" w:sz="8" w:space="0" w:color="auto"/>
+            </w:tcBorders>
+          </w:tcPr>
+          <w:p>
+            <w:pPr>
+              <w:jc w:val="center"/>
+              <w:rPr>
+                <w:rFonts w:ascii="Times New Roman" w:eastAsiaTheme="minorEastAsia" w:hAnsi="Times New Roman" w:cs="Times New Roman"/>
+              </w:rPr>
+            </w:pPr>
+            <w:r>
+              <w:rPr>
+                <w:rFonts w:ascii="Times New Roman" w:eastAsiaTheme="minorEastAsia" w:hAnsi="Times New Roman" w:cs="Times New Roman"/>
+              </w:rPr>
+              <w:t>800</w:t>
+            </w:r>
+          </w:p>
+        </w:tc>
+        <w:tc>
+          <w:tcPr>
+            <w:tcW w:w="0" w:type="auto"/>
+            <w:tcBorders>
+              <w:left w:val="single" w:sz="8" w:space="0" w:color="auto"/>
+              <w:right w:val="single" w:sz="8" w:space="0" w:color="auto"/>
+            </w:tcBorders>
+          </w:tcPr>
+          <w:p>
+            <w:pPr>
+              <w:jc w:val="center"/>
+              <w:rPr>
+                <w:rFonts w:ascii="Times New Roman" w:eastAsiaTheme="minorEastAsia" w:hAnsi="Times New Roman" w:cs="Times New Roman"/>
+              </w:rPr>
+            </w:pPr>
+            <w:r>
+              <w:rPr>
+                <w:rFonts w:ascii="Times New Roman" w:eastAsiaTheme="minorEastAsia" w:hAnsi="Times New Roman" w:cs="Times New Roman"/>
+              </w:rPr>
+              <w:t>-0.16857801</w:t>
+            </w:r>
+          </w:p>
+        </w:tc>
+        <w:tc>
+          <w:tcPr>
+            <w:tcW w:w="0" w:type="auto"/>
+            <w:tcBorders>
+              <w:left w:val="single" w:sz="8" w:space="0" w:color="auto"/>
+              <w:right w:val="single" w:sz="8" w:space="0" w:color="auto"/>
+            </w:tcBorders>
+          </w:tcPr>
+          <w:p>
+            <w:pPr>
+              <w:jc w:val="center"/>
+              <w:rPr>
+                <w:rFonts w:ascii="Times New Roman" w:eastAsiaTheme="minorEastAsia" w:hAnsi="Times New Roman" w:cs="Times New Roman"/>
+              </w:rPr>
+            </w:pPr>
+            <w:r>
+              <w:rPr>
+                <w:rFonts w:ascii="Times New Roman" w:eastAsiaTheme="minorEastAsia" w:hAnsi="Times New Roman" w:cs="Times New Roman"/>
+              </w:rPr>
+              <w:t>11.251801</w:t>
+            </w:r>
+          </w:p>
+        </w:tc>
+      </w:tr>
+      <w:tr>
+        <w:trPr>
+          <w:jc w:val="center"/>
+        </w:trPr>
+        <w:tc>
+          <w:tcPr>
+            <w:tcW w:w="0" w:type="auto"/>
+            <w:tcBorders>
+              <w:left w:val="single" w:sz="8" w:space="0" w:color="auto"/>
+              <w:right w:val="single" w:sz="8" w:space="0" w:color="auto"/>
+            </w:tcBorders>
+          </w:tcPr>
+          <w:p>
+            <w:pPr>
+              <w:jc w:val="center"/>
+              <w:rPr>
+                <w:rFonts w:ascii="Times New Roman" w:eastAsiaTheme="minorEastAsia" w:hAnsi="Times New Roman" w:cs="Times New Roman"/>
+              </w:rPr>
+            </w:pPr>
+            <w:r>
+              <w:rPr>
+                <w:rFonts w:ascii="Times New Roman" w:eastAsiaTheme="minorEastAsia" w:hAnsi="Times New Roman" w:cs="Times New Roman"/>
+              </w:rPr>
+              <w:t>900</w:t>
+            </w:r>
+          </w:p>
+        </w:tc>
+        <w:tc>
+          <w:tcPr>
+            <w:tcW w:w="0" w:type="auto"/>
+            <w:tcBorders>
+              <w:left w:val="single" w:sz="8" w:space="0" w:color="auto"/>
+              <w:right w:val="single" w:sz="8" w:space="0" w:color="auto"/>
+            </w:tcBorders>
+          </w:tcPr>
+          <w:p>
+            <w:pPr>
+              <w:jc w:val="center"/>
+              <w:rPr>
+                <w:rFonts w:ascii="Times New Roman" w:eastAsiaTheme="minorEastAsia" w:hAnsi="Times New Roman" w:cs="Times New Roman"/>
+              </w:rPr>
+            </w:pPr>
+            <w:r>
+              <w:rPr>
+                <w:rFonts w:ascii="Times New Roman" w:eastAsiaTheme="minorEastAsia" w:hAnsi="Times New Roman" w:cs="Times New Roman"/>
+              </w:rPr>
+              <w:t>-0.13373748</w:t>
+            </w:r>
+          </w:p>
+        </w:tc>
+        <w:tc>
+          <w:tcPr>
+            <w:tcW w:w="0" w:type="auto"/>
+            <w:tcBorders>
+              <w:left w:val="single" w:sz="8" w:space="0" w:color="auto"/>
+              <w:right w:val="single" w:sz="8" w:space="0" w:color="auto"/>
+            </w:tcBorders>
+          </w:tcPr>
+          <w:p>
+            <w:pPr>
+              <w:jc w:val="center"/>
+              <w:rPr>
+                <w:rFonts w:ascii="Times New Roman" w:eastAsiaTheme="minorEastAsia" w:hAnsi="Times New Roman" w:cs="Times New Roman"/>
+              </w:rPr>
+            </w:pPr>
+            <w:r>
+              <w:rPr>
+                <w:rFonts w:ascii="Times New Roman" w:eastAsiaTheme="minorEastAsia" w:hAnsi="Times New Roman" w:cs="Times New Roman"/>
+              </w:rPr>
+              <w:t>10.028536</w:t>
+            </w:r>
+          </w:p>
+        </w:tc>
+      </w:tr>
+      <w:tr>
+        <w:trPr>
+          <w:jc w:val="center"/>
+        </w:trPr>
+        <w:tc>
+          <w:tcPr>
+            <w:tcW w:w="0" w:type="auto"/>
+            <w:tcBorders>
+              <w:left w:val="single" w:sz="8" w:space="0" w:color="auto"/>
+              <w:bottom w:val="single" w:sz="8" w:space="0" w:color="auto"/>
+              <w:right w:val="single" w:sz="8" w:space="0" w:color="auto"/>
+            </w:tcBorders>
+          </w:tcPr>
+          <w:p>
+            <w:pPr>
+              <w:jc w:val="center"/>
+              <w:rPr>
+                <w:rFonts w:ascii="Times New Roman" w:eastAsiaTheme="minorEastAsia" w:hAnsi="Times New Roman" w:cs="Times New Roman"/>
+              </w:rPr>
+            </w:pPr>
+            <w:r>
+              <w:rPr>
+                <w:rFonts w:ascii="Times New Roman" w:eastAsiaTheme="minorEastAsia" w:hAnsi="Times New Roman" w:cs="Times New Roman"/>
+              </w:rPr>
+              <w:t>1000</w:t>
+            </w:r>
+          </w:p>
+        </w:tc>
+        <w:tc>
+          <w:tcPr>
+            <w:tcW w:w="0" w:type="auto"/>
+            <w:tcBorders>
+              <w:left w:val="single" w:sz="8" w:space="0" w:color="auto"/>
+              <w:bottom w:val="single" w:sz="8" w:space="0" w:color="auto"/>
+              <w:right w:val="single" w:sz="8" w:space="0" w:color="auto"/>
+            </w:tcBorders>
+          </w:tcPr>
+          <w:p>
+            <w:pPr>
+              <w:jc w:val="center"/>
+              <w:rPr>
+                <w:rFonts w:ascii="Times New Roman" w:eastAsiaTheme="minorEastAsia" w:hAnsi="Times New Roman" w:cs="Times New Roman"/>
+              </w:rPr>
+            </w:pPr>
+            <w:r>
+              <w:rPr>
+                <w:rFonts w:ascii="Times New Roman" w:eastAsiaTheme="minorEastAsia" w:hAnsi="Times New Roman" w:cs="Times New Roman"/>
+              </w:rPr>
+              <w:t>-0.1086379</w:t>
+            </w:r>
+          </w:p>
+        </w:tc>
+        <w:tc>
+          <w:tcPr>
+            <w:tcW w:w="0" w:type="auto"/>
+            <w:tcBorders>
+              <w:left w:val="single" w:sz="8" w:space="0" w:color="auto"/>
+              <w:bottom w:val="single" w:sz="8" w:space="0" w:color="auto"/>
+              <w:right w:val="single" w:sz="8" w:space="0" w:color="auto"/>
+            </w:tcBorders>
+          </w:tcPr>
+          <w:p>
+            <w:pPr>
+              <w:jc w:val="center"/>
+              <w:rPr>
+                <w:rFonts w:ascii="Times New Roman" w:eastAsiaTheme="minorEastAsia" w:hAnsi="Times New Roman" w:cs="Times New Roman"/>
+              </w:rPr>
+            </w:pPr>
+            <w:r>
+              <w:rPr>
+                <w:rFonts w:ascii="Times New Roman" w:eastAsiaTheme="minorEastAsia" w:hAnsi="Times New Roman" w:cs="Times New Roman"/>
+              </w:rPr>
+              <w:t>9.0430611</w:t>
+            </w:r>
+          </w:p>
+        </w:tc>
+      </w:tr>
+    </w:tbl>
+    <w:p>
+      <w:pPr>
+        <w:spacing w:after="0" w:line="480" w:lineRule="auto"/>
+        <w:jc w:val="center"/>
+        <w:rPr>
+          <w:rFonts w:ascii="Times New Roman" w:hAnsi="Times New Roman" w:cs="Times New Roman"/>
+          <w:b/>
+          <w:bCs/>
+        </w:rPr>
+      </w:pPr>
+      <w:r>
+        <w:rPr>
+          <w:rFonts w:ascii="Times New Roman" w:hAnsi="Times New Roman" w:cs="Times New Roman"/>
+          <w:b/>
+          <w:bCs/>
+        </w:rPr>
+        <w:t>Table #</w:t>
+      </w:r>
+      <w:r>
+        <w:rPr>
+          <w:rFonts w:ascii="Times New Roman" w:hAnsi="Times New Roman" w:cs="Times New Roman"/>
+          <w:b/>
+          <w:bCs/>
+        </w:rPr>
+        <w:t>4</w:t>
+      </w:r>
+      <w:r>
+        <w:rPr>
+          <w:rFonts w:ascii="Times New Roman" w:hAnsi="Times New Roman" w:cs="Times New Roman"/>
+          <w:b/>
+          <w:bCs/>
+        </w:rPr>
+        <w:t>: High Pass Filter</w:t>
+      </w:r>
+      <w:r>
+        <w:rPr>
+          <w:rFonts w:ascii="Times New Roman" w:hAnsi="Times New Roman" w:cs="Times New Roman"/>
+          <w:b/>
+          <w:bCs/>
+        </w:rPr>
+        <w:t xml:space="preserve"> Simulation</w:t>
+      </w:r>
+      <w:r>
+        <w:rPr>
+          <w:rFonts w:ascii="Times New Roman" w:hAnsi="Times New Roman" w:cs="Times New Roman"/>
+          <w:b/>
+          <w:bCs/>
+        </w:rPr>
+        <w:t xml:space="preserve"> Results</w:t>
+      </w:r>
+    </w:p>
+    <w:p>
+      <w:pPr>
+        <w:spacing w:after="0" w:line="480" w:lineRule="auto"/>
+        <w:jc w:val="center"/>
+        <w:rPr>
+          <w:rFonts w:ascii="Times New Roman" w:hAnsi="Times New Roman" w:cs="Times New Roman"/>
+          <w:b/>
+          <w:bCs/>
+        </w:rPr>
+      </w:pPr>
+    </w:p>
+    <w:p>
+      <w:pPr>
+        <w:spacing w:after="0" w:line="480" w:lineRule="auto"/>
+        <w:jc w:val="center"/>
+        <w:rPr>
+          <w:rFonts w:ascii="Times New Roman" w:hAnsi="Times New Roman" w:cs="Times New Roman"/>
+          <w:b/>
+          <w:bCs/>
+        </w:rPr>
+      </w:pPr>
+    </w:p>
+    <w:p>
+      <w:pPr>
+        <w:spacing w:after="0" w:line="480" w:lineRule="auto"/>
+        <w:jc w:val="center"/>
+        <w:rPr>
+          <w:rFonts w:ascii="Times New Roman" w:hAnsi="Times New Roman" w:cs="Times New Roman"/>
+          <w:b/>
+          <w:bCs/>
+        </w:rPr>
+      </w:pPr>
+    </w:p>
     <w:sectPr>
       <w:pgSz w:w="12240" w:h="15840"/>
       <w:pgMar w:top="1440" w:right="1440" w:bottom="1440" w:left="1440" w:header="720" w:footer="720" w:gutter="0"/>

</xml_diff>